<commit_message>
Added contributions to Project Scope, Project Resources and Communication Plan portions of the project plan.
</commit_message>
<xml_diff>
--- a/docs/Project Plan.docx
+++ b/docs/Project Plan.docx
@@ -10,6 +10,7 @@
           <w:docPartUnique/>
         </w:docPartObj>
       </w:sdtPr>
+      <w:sdtEndPr/>
       <w:sdtContent>
         <w:p/>
         <w:p>
@@ -90,6 +91,7 @@
                                     <w:dataBinding w:prefixMappings="xmlns:ns0='http://purl.org/dc/elements/1.1/' xmlns:ns1='http://schemas.openxmlformats.org/package/2006/metadata/core-properties' " w:xpath="/ns1:coreProperties[1]/ns0:title[1]" w:storeItemID="{6C3C8BC8-F283-45AE-878A-BAB7291924A1}"/>
                                     <w:text/>
                                   </w:sdtPr>
+                                  <w:sdtEndPr/>
                                   <w:sdtContent>
                                     <w:r>
                                       <w:rPr>
@@ -116,6 +118,7 @@
                                   <w:dataBinding w:prefixMappings="xmlns:ns0='http://purl.org/dc/elements/1.1/' xmlns:ns1='http://schemas.openxmlformats.org/package/2006/metadata/core-properties' " w:xpath="/ns1:coreProperties[1]/ns0:subject[1]" w:storeItemID="{6C3C8BC8-F283-45AE-878A-BAB7291924A1}"/>
                                   <w:text/>
                                 </w:sdtPr>
+                                <w:sdtEndPr/>
                                 <w:sdtContent>
                                   <w:p>
                                     <w:pPr>
@@ -157,6 +160,7 @@
                                   <w:dataBinding w:prefixMappings="xmlns:ns0='http://purl.org/dc/elements/1.1/' xmlns:ns1='http://schemas.openxmlformats.org/package/2006/metadata/core-properties' " w:xpath="/ns1:coreProperties[1]/ns0:creator[1]" w:storeItemID="{6C3C8BC8-F283-45AE-878A-BAB7291924A1}"/>
                                   <w:text/>
                                 </w:sdtPr>
+                                <w:sdtEndPr/>
                                 <w:sdtContent>
                                   <w:p>
                                     <w:pPr>
@@ -332,6 +336,7 @@
                               <w:dataBinding w:prefixMappings="xmlns:ns0='http://purl.org/dc/elements/1.1/' xmlns:ns1='http://schemas.openxmlformats.org/package/2006/metadata/core-properties' " w:xpath="/ns1:coreProperties[1]/ns0:title[1]" w:storeItemID="{6C3C8BC8-F283-45AE-878A-BAB7291924A1}"/>
                               <w:text/>
                             </w:sdtPr>
+                            <w:sdtEndPr/>
                             <w:sdtContent>
                               <w:r>
                                 <w:rPr>
@@ -358,6 +363,7 @@
                             <w:dataBinding w:prefixMappings="xmlns:ns0='http://purl.org/dc/elements/1.1/' xmlns:ns1='http://schemas.openxmlformats.org/package/2006/metadata/core-properties' " w:xpath="/ns1:coreProperties[1]/ns0:subject[1]" w:storeItemID="{6C3C8BC8-F283-45AE-878A-BAB7291924A1}"/>
                             <w:text/>
                           </w:sdtPr>
+                          <w:sdtEndPr/>
                           <w:sdtContent>
                             <w:p>
                               <w:pPr>
@@ -399,6 +405,7 @@
                             <w:dataBinding w:prefixMappings="xmlns:ns0='http://purl.org/dc/elements/1.1/' xmlns:ns1='http://schemas.openxmlformats.org/package/2006/metadata/core-properties' " w:xpath="/ns1:coreProperties[1]/ns0:creator[1]" w:storeItemID="{6C3C8BC8-F283-45AE-878A-BAB7291924A1}"/>
                             <w:text/>
                           </w:sdtPr>
+                          <w:sdtEndPr/>
                           <w:sdtContent>
                             <w:p>
                               <w:pPr>
@@ -801,118 +808,93 @@
     </w:p>
     <w:p>
       <w:pPr>
-        <w:pStyle w:val="ListParagraph"/>
-        <w:numPr>
-          <w:ilvl w:val="0"/>
-          <w:numId w:val="42"/>
-        </w:numPr>
-        <w:ind w:left="360"/>
+        <w:ind w:firstLine="720"/>
       </w:pPr>
       <w:r>
-        <w:t>In-Scope:</w:t>
+        <w:t xml:space="preserve">The portions of the breakout game that are in scope from the highest level of importance to the lowest level would be the spawning/creation of gameplay objects, a </w:t>
+      </w:r>
+      <w:r>
+        <w:lastRenderedPageBreak/>
+        <w:t xml:space="preserve">basic physics/gameplay engine, clean GUI to allow the user to access the levels and better navigate the game, and integration of SFX and VFX. </w:t>
       </w:r>
     </w:p>
     <w:p>
       <w:pPr>
-        <w:pStyle w:val="ListParagraph"/>
-        <w:numPr>
-          <w:ilvl w:val="1"/>
-          <w:numId w:val="40"/>
-        </w:numPr>
+        <w:ind w:firstLine="720"/>
       </w:pPr>
       <w:r>
-        <w:t>Core gameplay loop (Start -&gt; Play -&gt; Win/Loss).</w:t>
+        <w:t xml:space="preserve">The items that need to be to be created for each level will include; the paddle, the ball, and an arrangement of bricks that corresponds to the level the user is currently on. This will likely require creation of objects for each of the above to be stored in a corresponding level object for each level. </w:t>
       </w:r>
     </w:p>
     <w:p>
       <w:pPr>
-        <w:pStyle w:val="ListParagraph"/>
-        <w:numPr>
-          <w:ilvl w:val="1"/>
-          <w:numId w:val="40"/>
-        </w:numPr>
+        <w:ind w:firstLine="720"/>
       </w:pPr>
       <w:r>
-        <w:t>GUI elements and sound effects integration.</w:t>
+        <w:t>The physics engine requires moving the balls current position based on a velocity vector, handling a collision with either a wall or a brick, and knowing when the ball goes out of bounds and a life should be lost. The gameplay engine should track lives lost to see when to end the game that way, track the bricks that are left to see when to end the game that way, track the time taken to finish, and calculate a score when the game is over.  The game engine will also connect the keypresses of the users to the intended game actions, which will only be a key to make the paddle go leftward and one to make it go rightward.</w:t>
       </w:r>
     </w:p>
     <w:p>
       <w:pPr>
-        <w:pStyle w:val="ListParagraph"/>
-        <w:numPr>
-          <w:ilvl w:val="1"/>
-          <w:numId w:val="40"/>
-        </w:numPr>
+        <w:ind w:firstLine="720"/>
       </w:pPr>
       <w:r>
-        <w:lastRenderedPageBreak/>
-        <w:t>Basic level progression.</w:t>
+        <w:t xml:space="preserve">The GUI will include, as of now, three main pages; the start screen, the level select screen, and the game play screen. The title/start screen will include the title of the game, the creators, and a button to ‘start’ the game which will bring the user to the level select screen. The level screen will be a grid of buttons that when clicked on take the user to the corresponding level. The level screen will have, as mentioned previously, a paddle, a ball, some number of bricks, some display of lives left, current score, and maybe even time elapsed in level. </w:t>
       </w:r>
     </w:p>
     <w:p>
       <w:pPr>
-        <w:pStyle w:val="ListParagraph"/>
-        <w:numPr>
-          <w:ilvl w:val="0"/>
-          <w:numId w:val="42"/>
-        </w:numPr>
-        <w:ind w:left="360"/>
+        <w:ind w:firstLine="720"/>
       </w:pPr>
       <w:r>
-        <w:t>Out-of-Scope (Limitations):</w:t>
+        <w:t xml:space="preserve">The last main in-scope addition would be the improvement of VFX and  addition SFX. The SFX additions could include a background music, a sound when clicking on buttons, as sound when a block breaks, and when the ball bounces off the wall. VFX additions could include having the blocks break apart when destroyed instead of instantly disappearing. </w:t>
       </w:r>
     </w:p>
     <w:p>
       <w:pPr>
-        <w:pStyle w:val="ListParagraph"/>
-        <w:numPr>
-          <w:ilvl w:val="1"/>
-          <w:numId w:val="40"/>
-        </w:numPr>
+        <w:ind w:firstLine="720"/>
       </w:pPr>
       <w:r>
-        <w:t>Online multiplayer functionality.</w:t>
+        <w:t xml:space="preserve">Some additional features that could be implemented but are out of scope for the initial project, if the time and resources are available, would be a leader board for high scores for each level, but that would only be implemented after extensive testing of the in-scope requirements. </w:t>
+      </w:r>
+      <w:r>
+        <w:t>Additional out-of-scope</w:t>
+      </w:r>
+      <w:r>
+        <w:t xml:space="preserve"> portions would be enabling multiplayer, as that would involve a massive increase in </w:t>
+      </w:r>
+      <w:r>
+        <w:t xml:space="preserve">the effort and time required in the somewhat limited amount of time that we have. </w:t>
       </w:r>
     </w:p>
+    <w:p/>
     <w:p>
       <w:pPr>
-        <w:pStyle w:val="ListParagraph"/>
-        <w:numPr>
-          <w:ilvl w:val="1"/>
-          <w:numId w:val="40"/>
-        </w:numPr>
+        <w:pStyle w:val="Heading1"/>
       </w:pPr>
       <w:r>
-        <w:t>Persistent global leaderboards (Database integration).</w:t>
-      </w:r>
-    </w:p>
-    <w:p>
-      <w:pPr>
-        <w:pStyle w:val="Heading1"/>
-      </w:pPr>
-      <w:r>
+        <w:lastRenderedPageBreak/>
         <w:t>Project Resources</w:t>
       </w:r>
     </w:p>
     <w:p>
+      <w:r>
+        <w:rPr>
+          <w:u w:val="single"/>
+        </w:rPr>
+        <w:t>Team Members and Roles:</w:t>
+      </w:r>
+    </w:p>
+    <w:p>
       <w:pPr>
         <w:pStyle w:val="ListParagraph"/>
         <w:numPr>
           <w:ilvl w:val="0"/>
-          <w:numId w:val="42"/>
+          <w:numId w:val="50"/>
         </w:numPr>
-        <w:ind w:left="360"/>
       </w:pPr>
       <w:r>
-        <w:t xml:space="preserve">Personnel: </w:t>
-      </w:r>
-      <w:proofErr w:type="gramStart"/>
-      <w:r>
-        <w:t>List</w:t>
-      </w:r>
-      <w:proofErr w:type="gramEnd"/>
-      <w:r>
-        <w:t xml:space="preserve"> the five team members. (Note: Roles like Project Manager, Lead Developer, and QA Tester should be defined here later).</w:t>
+        <w:t>Ethan Wasniak:</w:t>
       </w:r>
     </w:p>
     <w:p>
@@ -920,71 +902,74 @@
         <w:pStyle w:val="ListParagraph"/>
         <w:numPr>
           <w:ilvl w:val="0"/>
-          <w:numId w:val="42"/>
+          <w:numId w:val="50"/>
         </w:numPr>
-        <w:ind w:left="360"/>
       </w:pPr>
       <w:r>
-        <w:t>Equipment/Software:</w:t>
+        <w:t>Brendan Laird:</w:t>
       </w:r>
     </w:p>
     <w:p>
       <w:pPr>
         <w:pStyle w:val="ListParagraph"/>
         <w:numPr>
-          <w:ilvl w:val="1"/>
-          <w:numId w:val="40"/>
+          <w:ilvl w:val="0"/>
+          <w:numId w:val="50"/>
         </w:numPr>
       </w:pPr>
       <w:r>
-        <w:t>Development Environment: Visual Studio Code with Live Share.</w:t>
+        <w:t>Steven Dickinson:</w:t>
       </w:r>
     </w:p>
     <w:p>
       <w:pPr>
         <w:pStyle w:val="ListParagraph"/>
         <w:numPr>
-          <w:ilvl w:val="1"/>
-          <w:numId w:val="40"/>
+          <w:ilvl w:val="0"/>
+          <w:numId w:val="50"/>
         </w:numPr>
       </w:pPr>
       <w:r>
-        <w:t xml:space="preserve">Languages/Libraries: Python 3.x and </w:t>
-      </w:r>
-      <w:proofErr w:type="spellStart"/>
-      <w:r>
-        <w:t>pygame</w:t>
-      </w:r>
-      <w:proofErr w:type="spellEnd"/>
-      <w:r>
-        <w:t>.</w:t>
+        <w:t>Kenise Balton:</w:t>
       </w:r>
     </w:p>
     <w:p>
       <w:pPr>
         <w:pStyle w:val="ListParagraph"/>
         <w:numPr>
-          <w:ilvl w:val="1"/>
-          <w:numId w:val="40"/>
+          <w:ilvl w:val="0"/>
+          <w:numId w:val="50"/>
         </w:numPr>
       </w:pPr>
       <w:r>
-        <w:t>Version Control: GitHub for code repository management.</w:t>
+        <w:t>Francini Clemmons:</w:t>
       </w:r>
     </w:p>
     <w:p>
       <w:pPr>
-        <w:pStyle w:val="ListParagraph"/>
-        <w:numPr>
-          <w:ilvl w:val="0"/>
-          <w:numId w:val="42"/>
-        </w:numPr>
-        <w:ind w:left="360"/>
+        <w:ind w:firstLine="720"/>
       </w:pPr>
       <w:r>
-        <w:t>Budget: Standard academic project with $0.00 USD allocation, utilizing open-source tools.</w:t>
+        <w:t xml:space="preserve">The programming language that will be used for the majority of this project will be C++. The libraries being used will be </w:t>
+      </w:r>
+      <w:r>
+        <w:rPr>
+          <w:i/>
+          <w:iCs/>
+        </w:rPr>
+        <w:t>[What libraries are being used]</w:t>
+      </w:r>
+      <w:r>
+        <w:t>. There will be a budget of $0.00 USD, which is standard for a</w:t>
+      </w:r>
+      <w:r>
+        <w:t>n</w:t>
+      </w:r>
+      <w:r>
+        <w:t xml:space="preserve"> academic project and open-source or other free tools will be used. For version control, we will be using Git and GitHub.</w:t>
       </w:r>
     </w:p>
+    <w:p/>
     <w:p>
       <w:pPr>
         <w:pStyle w:val="Heading1"/>
@@ -995,65 +980,24 @@
     </w:p>
     <w:p>
       <w:pPr>
-        <w:pStyle w:val="ListParagraph"/>
-        <w:numPr>
-          <w:ilvl w:val="0"/>
-          <w:numId w:val="42"/>
-        </w:numPr>
-        <w:ind w:left="360"/>
+        <w:ind w:firstLine="720"/>
       </w:pPr>
       <w:r>
-        <w:t>Channels:</w:t>
+        <w:t xml:space="preserve">The main communication method of the group would be through a Discord server where all group members can send messages and have discussions about the project and its requirements. Along with using Git/GitHub </w:t>
+      </w:r>
+      <w:r>
+        <w:t>as</w:t>
+      </w:r>
+      <w:r>
+        <w:t xml:space="preserve"> a configuration management tool, we are also using it for now as our file sharing method as well, as it can update different sections of the documentation as different people commit and push additions. </w:t>
       </w:r>
     </w:p>
     <w:p>
       <w:pPr>
-        <w:pStyle w:val="ListParagraph"/>
-        <w:numPr>
-          <w:ilvl w:val="1"/>
-          <w:numId w:val="40"/>
-        </w:numPr>
+        <w:ind w:firstLine="720"/>
       </w:pPr>
       <w:r>
-        <w:t>Primary: Microsoft Teams for daily updates and file sharing.</w:t>
-      </w:r>
-    </w:p>
-    <w:p>
-      <w:pPr>
-        <w:pStyle w:val="ListParagraph"/>
-        <w:numPr>
-          <w:ilvl w:val="1"/>
-          <w:numId w:val="40"/>
-        </w:numPr>
-      </w:pPr>
-      <w:r>
-        <w:t>Meetings: Weekly virtual syncs (e.g., Saturdays via Zoom or Teams) to discuss progress and blockers.</w:t>
-      </w:r>
-    </w:p>
-    <w:p>
-      <w:pPr>
-        <w:pStyle w:val="ListParagraph"/>
-        <w:numPr>
-          <w:ilvl w:val="0"/>
-          <w:numId w:val="42"/>
-        </w:numPr>
-        <w:ind w:left="360"/>
-      </w:pPr>
-      <w:r>
-        <w:t>Frequency: Define daily check-ins for active developers and weekly formal status reports for the instructor.</w:t>
-      </w:r>
-    </w:p>
-    <w:p>
-      <w:pPr>
-        <w:pStyle w:val="ListParagraph"/>
-        <w:numPr>
-          <w:ilvl w:val="0"/>
-          <w:numId w:val="42"/>
-        </w:numPr>
-        <w:ind w:left="360"/>
-      </w:pPr>
-      <w:r>
-        <w:t>Responsibilities: Every member is responsible for checking the primary channel at least once every 24 hours.</w:t>
+        <w:t xml:space="preserve">Each group member will be expected to check in on the discord at least once daily to check if there is anything that needs to be implemented and/or changed that may impact the portion of the project that they are responsible for. Each group member should also post updates on what they are doing/implementing in the program, especially when they push something to the GitHub repo so everyone knows what everyone is doing and if there is a new version in the repo that can be pulled.  </w:t>
       </w:r>
     </w:p>
     <w:p>
@@ -1108,6 +1052,7 @@
         <w:ind w:left="360"/>
       </w:pPr>
       <w:r>
+        <w:lastRenderedPageBreak/>
         <w:t>Integration Risks: Use frequent GitHub commits to catch code conflicts early</w:t>
       </w:r>
     </w:p>
@@ -1116,7 +1061,6 @@
         <w:pStyle w:val="Heading1"/>
       </w:pPr>
       <w:r>
-        <w:lastRenderedPageBreak/>
         <w:t>Schedule and Milestones</w:t>
       </w:r>
     </w:p>
@@ -2415,6 +2359,119 @@
     </w:lvl>
   </w:abstractNum>
   <w:abstractNum w:abstractNumId="9" w15:restartNumberingAfterBreak="0">
+    <w:nsid w:val="20F03DD7"/>
+    <w:multiLevelType w:val="hybridMultilevel"/>
+    <w:tmpl w:val="2D1E4526"/>
+    <w:lvl w:ilvl="0" w:tplc="04090001">
+      <w:start w:val="1"/>
+      <w:numFmt w:val="bullet"/>
+      <w:lvlText w:val=""/>
+      <w:lvlJc w:val="left"/>
+      <w:pPr>
+        <w:ind w:left="720" w:hanging="360"/>
+      </w:pPr>
+      <w:rPr>
+        <w:rFonts w:ascii="Symbol" w:hAnsi="Symbol" w:hint="default"/>
+      </w:rPr>
+    </w:lvl>
+    <w:lvl w:ilvl="1" w:tplc="04090003" w:tentative="1">
+      <w:start w:val="1"/>
+      <w:numFmt w:val="bullet"/>
+      <w:lvlText w:val="o"/>
+      <w:lvlJc w:val="left"/>
+      <w:pPr>
+        <w:ind w:left="1440" w:hanging="360"/>
+      </w:pPr>
+      <w:rPr>
+        <w:rFonts w:ascii="Courier New" w:hAnsi="Courier New" w:cs="Courier New" w:hint="default"/>
+      </w:rPr>
+    </w:lvl>
+    <w:lvl w:ilvl="2" w:tplc="04090005" w:tentative="1">
+      <w:start w:val="1"/>
+      <w:numFmt w:val="bullet"/>
+      <w:lvlText w:val=""/>
+      <w:lvlJc w:val="left"/>
+      <w:pPr>
+        <w:ind w:left="2160" w:hanging="360"/>
+      </w:pPr>
+      <w:rPr>
+        <w:rFonts w:ascii="Wingdings" w:hAnsi="Wingdings" w:hint="default"/>
+      </w:rPr>
+    </w:lvl>
+    <w:lvl w:ilvl="3" w:tplc="04090001" w:tentative="1">
+      <w:start w:val="1"/>
+      <w:numFmt w:val="bullet"/>
+      <w:lvlText w:val=""/>
+      <w:lvlJc w:val="left"/>
+      <w:pPr>
+        <w:ind w:left="2880" w:hanging="360"/>
+      </w:pPr>
+      <w:rPr>
+        <w:rFonts w:ascii="Symbol" w:hAnsi="Symbol" w:hint="default"/>
+      </w:rPr>
+    </w:lvl>
+    <w:lvl w:ilvl="4" w:tplc="04090003" w:tentative="1">
+      <w:start w:val="1"/>
+      <w:numFmt w:val="bullet"/>
+      <w:lvlText w:val="o"/>
+      <w:lvlJc w:val="left"/>
+      <w:pPr>
+        <w:ind w:left="3600" w:hanging="360"/>
+      </w:pPr>
+      <w:rPr>
+        <w:rFonts w:ascii="Courier New" w:hAnsi="Courier New" w:cs="Courier New" w:hint="default"/>
+      </w:rPr>
+    </w:lvl>
+    <w:lvl w:ilvl="5" w:tplc="04090005" w:tentative="1">
+      <w:start w:val="1"/>
+      <w:numFmt w:val="bullet"/>
+      <w:lvlText w:val=""/>
+      <w:lvlJc w:val="left"/>
+      <w:pPr>
+        <w:ind w:left="4320" w:hanging="360"/>
+      </w:pPr>
+      <w:rPr>
+        <w:rFonts w:ascii="Wingdings" w:hAnsi="Wingdings" w:hint="default"/>
+      </w:rPr>
+    </w:lvl>
+    <w:lvl w:ilvl="6" w:tplc="04090001" w:tentative="1">
+      <w:start w:val="1"/>
+      <w:numFmt w:val="bullet"/>
+      <w:lvlText w:val=""/>
+      <w:lvlJc w:val="left"/>
+      <w:pPr>
+        <w:ind w:left="5040" w:hanging="360"/>
+      </w:pPr>
+      <w:rPr>
+        <w:rFonts w:ascii="Symbol" w:hAnsi="Symbol" w:hint="default"/>
+      </w:rPr>
+    </w:lvl>
+    <w:lvl w:ilvl="7" w:tplc="04090003" w:tentative="1">
+      <w:start w:val="1"/>
+      <w:numFmt w:val="bullet"/>
+      <w:lvlText w:val="o"/>
+      <w:lvlJc w:val="left"/>
+      <w:pPr>
+        <w:ind w:left="5760" w:hanging="360"/>
+      </w:pPr>
+      <w:rPr>
+        <w:rFonts w:ascii="Courier New" w:hAnsi="Courier New" w:cs="Courier New" w:hint="default"/>
+      </w:rPr>
+    </w:lvl>
+    <w:lvl w:ilvl="8" w:tplc="04090005" w:tentative="1">
+      <w:start w:val="1"/>
+      <w:numFmt w:val="bullet"/>
+      <w:lvlText w:val=""/>
+      <w:lvlJc w:val="left"/>
+      <w:pPr>
+        <w:ind w:left="6480" w:hanging="360"/>
+      </w:pPr>
+      <w:rPr>
+        <w:rFonts w:ascii="Wingdings" w:hAnsi="Wingdings" w:hint="default"/>
+      </w:rPr>
+    </w:lvl>
+  </w:abstractNum>
+  <w:abstractNum w:abstractNumId="10" w15:restartNumberingAfterBreak="0">
     <w:nsid w:val="228E69D2"/>
     <w:multiLevelType w:val="multilevel"/>
     <w:tmpl w:val="E234A99E"/>
@@ -2526,7 +2583,7 @@
       </w:pPr>
     </w:lvl>
   </w:abstractNum>
-  <w:abstractNum w:abstractNumId="10" w15:restartNumberingAfterBreak="0">
+  <w:abstractNum w:abstractNumId="11" w15:restartNumberingAfterBreak="0">
     <w:nsid w:val="27907E30"/>
     <w:multiLevelType w:val="multilevel"/>
     <w:tmpl w:val="E234A99E"/>
@@ -2638,7 +2695,7 @@
       </w:pPr>
     </w:lvl>
   </w:abstractNum>
-  <w:abstractNum w:abstractNumId="11" w15:restartNumberingAfterBreak="0">
+  <w:abstractNum w:abstractNumId="12" w15:restartNumberingAfterBreak="0">
     <w:nsid w:val="27A23992"/>
     <w:multiLevelType w:val="multilevel"/>
     <w:tmpl w:val="9DA89D7E"/>
@@ -2751,7 +2808,7 @@
       </w:pPr>
     </w:lvl>
   </w:abstractNum>
-  <w:abstractNum w:abstractNumId="12" w15:restartNumberingAfterBreak="0">
+  <w:abstractNum w:abstractNumId="13" w15:restartNumberingAfterBreak="0">
     <w:nsid w:val="291D6A27"/>
     <w:multiLevelType w:val="multilevel"/>
     <w:tmpl w:val="9DA89D7E"/>
@@ -2864,7 +2921,7 @@
       </w:pPr>
     </w:lvl>
   </w:abstractNum>
-  <w:abstractNum w:abstractNumId="13" w15:restartNumberingAfterBreak="0">
+  <w:abstractNum w:abstractNumId="14" w15:restartNumberingAfterBreak="0">
     <w:nsid w:val="29322985"/>
     <w:multiLevelType w:val="multilevel"/>
     <w:tmpl w:val="3F3644EE"/>
@@ -3013,7 +3070,7 @@
       </w:rPr>
     </w:lvl>
   </w:abstractNum>
-  <w:abstractNum w:abstractNumId="14" w15:restartNumberingAfterBreak="0">
+  <w:abstractNum w:abstractNumId="15" w15:restartNumberingAfterBreak="0">
     <w:nsid w:val="2942105D"/>
     <w:multiLevelType w:val="multilevel"/>
     <w:tmpl w:val="EEACE83E"/>
@@ -3126,7 +3183,7 @@
       </w:pPr>
     </w:lvl>
   </w:abstractNum>
-  <w:abstractNum w:abstractNumId="15" w15:restartNumberingAfterBreak="0">
+  <w:abstractNum w:abstractNumId="16" w15:restartNumberingAfterBreak="0">
     <w:nsid w:val="2A3F7ABC"/>
     <w:multiLevelType w:val="multilevel"/>
     <w:tmpl w:val="82AEB148"/>
@@ -3239,7 +3296,7 @@
       </w:pPr>
     </w:lvl>
   </w:abstractNum>
-  <w:abstractNum w:abstractNumId="16" w15:restartNumberingAfterBreak="0">
+  <w:abstractNum w:abstractNumId="17" w15:restartNumberingAfterBreak="0">
     <w:nsid w:val="2A886615"/>
     <w:multiLevelType w:val="multilevel"/>
     <w:tmpl w:val="084A61EE"/>
@@ -3356,7 +3413,7 @@
       </w:pPr>
     </w:lvl>
   </w:abstractNum>
-  <w:abstractNum w:abstractNumId="17" w15:restartNumberingAfterBreak="0">
+  <w:abstractNum w:abstractNumId="18" w15:restartNumberingAfterBreak="0">
     <w:nsid w:val="2AA81F2B"/>
     <w:multiLevelType w:val="multilevel"/>
     <w:tmpl w:val="C2B40AE6"/>
@@ -3469,7 +3526,7 @@
       </w:pPr>
     </w:lvl>
   </w:abstractNum>
-  <w:abstractNum w:abstractNumId="18" w15:restartNumberingAfterBreak="0">
+  <w:abstractNum w:abstractNumId="19" w15:restartNumberingAfterBreak="0">
     <w:nsid w:val="2FFA3857"/>
     <w:multiLevelType w:val="hybridMultilevel"/>
     <w:tmpl w:val="C45EC048"/>
@@ -3582,7 +3639,7 @@
       </w:rPr>
     </w:lvl>
   </w:abstractNum>
-  <w:abstractNum w:abstractNumId="19" w15:restartNumberingAfterBreak="0">
+  <w:abstractNum w:abstractNumId="20" w15:restartNumberingAfterBreak="0">
     <w:nsid w:val="31F25C10"/>
     <w:multiLevelType w:val="multilevel"/>
     <w:tmpl w:val="2E2E16C4"/>
@@ -3695,7 +3752,7 @@
       </w:pPr>
     </w:lvl>
   </w:abstractNum>
-  <w:abstractNum w:abstractNumId="20" w15:restartNumberingAfterBreak="0">
+  <w:abstractNum w:abstractNumId="21" w15:restartNumberingAfterBreak="0">
     <w:nsid w:val="38B36121"/>
     <w:multiLevelType w:val="hybridMultilevel"/>
     <w:tmpl w:val="144AB672"/>
@@ -3808,7 +3865,7 @@
       </w:rPr>
     </w:lvl>
   </w:abstractNum>
-  <w:abstractNum w:abstractNumId="21" w15:restartNumberingAfterBreak="0">
+  <w:abstractNum w:abstractNumId="22" w15:restartNumberingAfterBreak="0">
     <w:nsid w:val="3D74412E"/>
     <w:multiLevelType w:val="multilevel"/>
     <w:tmpl w:val="7CFAE48C"/>
@@ -3921,7 +3978,7 @@
       </w:pPr>
     </w:lvl>
   </w:abstractNum>
-  <w:abstractNum w:abstractNumId="22" w15:restartNumberingAfterBreak="0">
+  <w:abstractNum w:abstractNumId="23" w15:restartNumberingAfterBreak="0">
     <w:nsid w:val="3E063E29"/>
     <w:multiLevelType w:val="multilevel"/>
     <w:tmpl w:val="E234A99E"/>
@@ -4033,7 +4090,7 @@
       </w:pPr>
     </w:lvl>
   </w:abstractNum>
-  <w:abstractNum w:abstractNumId="23" w15:restartNumberingAfterBreak="0">
+  <w:abstractNum w:abstractNumId="24" w15:restartNumberingAfterBreak="0">
     <w:nsid w:val="3E230D32"/>
     <w:multiLevelType w:val="hybridMultilevel"/>
     <w:tmpl w:val="C5A0243A"/>
@@ -4146,7 +4203,7 @@
       </w:rPr>
     </w:lvl>
   </w:abstractNum>
-  <w:abstractNum w:abstractNumId="24" w15:restartNumberingAfterBreak="0">
+  <w:abstractNum w:abstractNumId="25" w15:restartNumberingAfterBreak="0">
     <w:nsid w:val="3F5E488C"/>
     <w:multiLevelType w:val="multilevel"/>
     <w:tmpl w:val="E234A99E"/>
@@ -4258,7 +4315,7 @@
       </w:pPr>
     </w:lvl>
   </w:abstractNum>
-  <w:abstractNum w:abstractNumId="25" w15:restartNumberingAfterBreak="0">
+  <w:abstractNum w:abstractNumId="26" w15:restartNumberingAfterBreak="0">
     <w:nsid w:val="403B56B0"/>
     <w:multiLevelType w:val="hybridMultilevel"/>
     <w:tmpl w:val="E940D48C"/>
@@ -4371,7 +4428,7 @@
       </w:rPr>
     </w:lvl>
   </w:abstractNum>
-  <w:abstractNum w:abstractNumId="26" w15:restartNumberingAfterBreak="0">
+  <w:abstractNum w:abstractNumId="27" w15:restartNumberingAfterBreak="0">
     <w:nsid w:val="40484EC6"/>
     <w:multiLevelType w:val="multilevel"/>
     <w:tmpl w:val="9DA89D7E"/>
@@ -4484,7 +4541,7 @@
       </w:pPr>
     </w:lvl>
   </w:abstractNum>
-  <w:abstractNum w:abstractNumId="27" w15:restartNumberingAfterBreak="0">
+  <w:abstractNum w:abstractNumId="28" w15:restartNumberingAfterBreak="0">
     <w:nsid w:val="420320F7"/>
     <w:multiLevelType w:val="hybridMultilevel"/>
     <w:tmpl w:val="F80C81D8"/>
@@ -4597,7 +4654,7 @@
       </w:rPr>
     </w:lvl>
   </w:abstractNum>
-  <w:abstractNum w:abstractNumId="28" w15:restartNumberingAfterBreak="0">
+  <w:abstractNum w:abstractNumId="29" w15:restartNumberingAfterBreak="0">
     <w:nsid w:val="43222376"/>
     <w:multiLevelType w:val="multilevel"/>
     <w:tmpl w:val="40F8C162"/>
@@ -4710,7 +4767,7 @@
       </w:pPr>
     </w:lvl>
   </w:abstractNum>
-  <w:abstractNum w:abstractNumId="29" w15:restartNumberingAfterBreak="0">
+  <w:abstractNum w:abstractNumId="30" w15:restartNumberingAfterBreak="0">
     <w:nsid w:val="46BE2096"/>
     <w:multiLevelType w:val="multilevel"/>
     <w:tmpl w:val="E234A99E"/>
@@ -4822,7 +4879,7 @@
       </w:pPr>
     </w:lvl>
   </w:abstractNum>
-  <w:abstractNum w:abstractNumId="30" w15:restartNumberingAfterBreak="0">
+  <w:abstractNum w:abstractNumId="31" w15:restartNumberingAfterBreak="0">
     <w:nsid w:val="47246C85"/>
     <w:multiLevelType w:val="multilevel"/>
     <w:tmpl w:val="9DA89D7E"/>
@@ -4935,7 +4992,7 @@
       </w:pPr>
     </w:lvl>
   </w:abstractNum>
-  <w:abstractNum w:abstractNumId="31" w15:restartNumberingAfterBreak="0">
+  <w:abstractNum w:abstractNumId="32" w15:restartNumberingAfterBreak="0">
     <w:nsid w:val="4F330C99"/>
     <w:multiLevelType w:val="hybridMultilevel"/>
     <w:tmpl w:val="03C4BC1C"/>
@@ -5024,7 +5081,7 @@
       </w:pPr>
     </w:lvl>
   </w:abstractNum>
-  <w:abstractNum w:abstractNumId="32" w15:restartNumberingAfterBreak="0">
+  <w:abstractNum w:abstractNumId="33" w15:restartNumberingAfterBreak="0">
     <w:nsid w:val="55166742"/>
     <w:multiLevelType w:val="multilevel"/>
     <w:tmpl w:val="E234A99E"/>
@@ -5136,7 +5193,7 @@
       </w:pPr>
     </w:lvl>
   </w:abstractNum>
-  <w:abstractNum w:abstractNumId="33" w15:restartNumberingAfterBreak="0">
+  <w:abstractNum w:abstractNumId="34" w15:restartNumberingAfterBreak="0">
     <w:nsid w:val="573F667B"/>
     <w:multiLevelType w:val="hybridMultilevel"/>
     <w:tmpl w:val="B2C4778E"/>
@@ -5222,7 +5279,7 @@
       </w:pPr>
     </w:lvl>
   </w:abstractNum>
-  <w:abstractNum w:abstractNumId="34" w15:restartNumberingAfterBreak="0">
+  <w:abstractNum w:abstractNumId="35" w15:restartNumberingAfterBreak="0">
     <w:nsid w:val="57755A95"/>
     <w:multiLevelType w:val="multilevel"/>
     <w:tmpl w:val="C2E67A7E"/>
@@ -5335,7 +5392,7 @@
       </w:pPr>
     </w:lvl>
   </w:abstractNum>
-  <w:abstractNum w:abstractNumId="35" w15:restartNumberingAfterBreak="0">
+  <w:abstractNum w:abstractNumId="36" w15:restartNumberingAfterBreak="0">
     <w:nsid w:val="5E121500"/>
     <w:multiLevelType w:val="hybridMultilevel"/>
     <w:tmpl w:val="8C646BE6"/>
@@ -5448,7 +5505,7 @@
       </w:rPr>
     </w:lvl>
   </w:abstractNum>
-  <w:abstractNum w:abstractNumId="36" w15:restartNumberingAfterBreak="0">
+  <w:abstractNum w:abstractNumId="37" w15:restartNumberingAfterBreak="0">
     <w:nsid w:val="61012222"/>
     <w:multiLevelType w:val="multilevel"/>
     <w:tmpl w:val="4760B90C"/>
@@ -5597,7 +5654,7 @@
       </w:rPr>
     </w:lvl>
   </w:abstractNum>
-  <w:abstractNum w:abstractNumId="37" w15:restartNumberingAfterBreak="0">
+  <w:abstractNum w:abstractNumId="38" w15:restartNumberingAfterBreak="0">
     <w:nsid w:val="61356BAD"/>
     <w:multiLevelType w:val="multilevel"/>
     <w:tmpl w:val="2E2E16C4"/>
@@ -5710,7 +5767,7 @@
       </w:pPr>
     </w:lvl>
   </w:abstractNum>
-  <w:abstractNum w:abstractNumId="38" w15:restartNumberingAfterBreak="0">
+  <w:abstractNum w:abstractNumId="39" w15:restartNumberingAfterBreak="0">
     <w:nsid w:val="61EC5821"/>
     <w:multiLevelType w:val="multilevel"/>
     <w:tmpl w:val="E234A99E"/>
@@ -5822,7 +5879,7 @@
       </w:pPr>
     </w:lvl>
   </w:abstractNum>
-  <w:abstractNum w:abstractNumId="39" w15:restartNumberingAfterBreak="0">
+  <w:abstractNum w:abstractNumId="40" w15:restartNumberingAfterBreak="0">
     <w:nsid w:val="669812D1"/>
     <w:multiLevelType w:val="multilevel"/>
     <w:tmpl w:val="E234A99E"/>
@@ -5934,7 +5991,7 @@
       </w:pPr>
     </w:lvl>
   </w:abstractNum>
-  <w:abstractNum w:abstractNumId="40" w15:restartNumberingAfterBreak="0">
+  <w:abstractNum w:abstractNumId="41" w15:restartNumberingAfterBreak="0">
     <w:nsid w:val="67A62AB6"/>
     <w:multiLevelType w:val="multilevel"/>
     <w:tmpl w:val="E234A99E"/>
@@ -6046,7 +6103,7 @@
       </w:pPr>
     </w:lvl>
   </w:abstractNum>
-  <w:abstractNum w:abstractNumId="41" w15:restartNumberingAfterBreak="0">
+  <w:abstractNum w:abstractNumId="42" w15:restartNumberingAfterBreak="0">
     <w:nsid w:val="68275E01"/>
     <w:multiLevelType w:val="multilevel"/>
     <w:tmpl w:val="25743380"/>
@@ -6195,7 +6252,7 @@
       </w:rPr>
     </w:lvl>
   </w:abstractNum>
-  <w:abstractNum w:abstractNumId="42" w15:restartNumberingAfterBreak="0">
+  <w:abstractNum w:abstractNumId="43" w15:restartNumberingAfterBreak="0">
     <w:nsid w:val="6B4B7322"/>
     <w:multiLevelType w:val="hybridMultilevel"/>
     <w:tmpl w:val="B270FCEA"/>
@@ -6284,7 +6341,7 @@
       </w:pPr>
     </w:lvl>
   </w:abstractNum>
-  <w:abstractNum w:abstractNumId="43" w15:restartNumberingAfterBreak="0">
+  <w:abstractNum w:abstractNumId="44" w15:restartNumberingAfterBreak="0">
     <w:nsid w:val="726A29CA"/>
     <w:multiLevelType w:val="multilevel"/>
     <w:tmpl w:val="CDBA0A10"/>
@@ -6397,7 +6454,7 @@
       </w:pPr>
     </w:lvl>
   </w:abstractNum>
-  <w:abstractNum w:abstractNumId="44" w15:restartNumberingAfterBreak="0">
+  <w:abstractNum w:abstractNumId="45" w15:restartNumberingAfterBreak="0">
     <w:nsid w:val="73BF4073"/>
     <w:multiLevelType w:val="hybridMultilevel"/>
     <w:tmpl w:val="949A5C0E"/>
@@ -6510,7 +6567,7 @@
       </w:rPr>
     </w:lvl>
   </w:abstractNum>
-  <w:abstractNum w:abstractNumId="45" w15:restartNumberingAfterBreak="0">
+  <w:abstractNum w:abstractNumId="46" w15:restartNumberingAfterBreak="0">
     <w:nsid w:val="74C905EF"/>
     <w:multiLevelType w:val="multilevel"/>
     <w:tmpl w:val="E234A99E"/>
@@ -6622,7 +6679,7 @@
       </w:pPr>
     </w:lvl>
   </w:abstractNum>
-  <w:abstractNum w:abstractNumId="46" w15:restartNumberingAfterBreak="0">
+  <w:abstractNum w:abstractNumId="47" w15:restartNumberingAfterBreak="0">
     <w:nsid w:val="756151B8"/>
     <w:multiLevelType w:val="hybridMultilevel"/>
     <w:tmpl w:val="91E21CF4"/>
@@ -6735,7 +6792,7 @@
       </w:rPr>
     </w:lvl>
   </w:abstractNum>
-  <w:abstractNum w:abstractNumId="47" w15:restartNumberingAfterBreak="0">
+  <w:abstractNum w:abstractNumId="48" w15:restartNumberingAfterBreak="0">
     <w:nsid w:val="77704983"/>
     <w:multiLevelType w:val="multilevel"/>
     <w:tmpl w:val="F502160C"/>
@@ -6848,7 +6905,7 @@
       </w:pPr>
     </w:lvl>
   </w:abstractNum>
-  <w:abstractNum w:abstractNumId="48" w15:restartNumberingAfterBreak="0">
+  <w:abstractNum w:abstractNumId="49" w15:restartNumberingAfterBreak="0">
     <w:nsid w:val="7FD85B1F"/>
     <w:multiLevelType w:val="multilevel"/>
     <w:tmpl w:val="0526DFB6"/>
@@ -6998,151 +7055,154 @@
     </w:lvl>
   </w:abstractNum>
   <w:num w:numId="1" w16cid:durableId="829639480">
+    <w:abstractNumId w:val="17"/>
+  </w:num>
+  <w:num w:numId="2" w16cid:durableId="673920208">
+    <w:abstractNumId w:val="41"/>
+  </w:num>
+  <w:num w:numId="3" w16cid:durableId="1820226238">
+    <w:abstractNumId w:val="35"/>
+  </w:num>
+  <w:num w:numId="4" w16cid:durableId="1268584147">
     <w:abstractNumId w:val="16"/>
   </w:num>
-  <w:num w:numId="2" w16cid:durableId="673920208">
-    <w:abstractNumId w:val="40"/>
-  </w:num>
-  <w:num w:numId="3" w16cid:durableId="1820226238">
-    <w:abstractNumId w:val="34"/>
-  </w:num>
-  <w:num w:numId="4" w16cid:durableId="1268584147">
-    <w:abstractNumId w:val="15"/>
-  </w:num>
   <w:num w:numId="5" w16cid:durableId="1596399559">
-    <w:abstractNumId w:val="37"/>
+    <w:abstractNumId w:val="38"/>
   </w:num>
   <w:num w:numId="6" w16cid:durableId="809785222">
-    <w:abstractNumId w:val="28"/>
+    <w:abstractNumId w:val="29"/>
   </w:num>
   <w:num w:numId="7" w16cid:durableId="1175193995">
-    <w:abstractNumId w:val="43"/>
+    <w:abstractNumId w:val="44"/>
   </w:num>
   <w:num w:numId="8" w16cid:durableId="1256481347">
-    <w:abstractNumId w:val="21"/>
+    <w:abstractNumId w:val="22"/>
   </w:num>
   <w:num w:numId="9" w16cid:durableId="653681627">
-    <w:abstractNumId w:val="47"/>
+    <w:abstractNumId w:val="48"/>
   </w:num>
   <w:num w:numId="10" w16cid:durableId="746534982">
     <w:abstractNumId w:val="7"/>
   </w:num>
   <w:num w:numId="11" w16cid:durableId="758520136">
-    <w:abstractNumId w:val="11"/>
+    <w:abstractNumId w:val="12"/>
   </w:num>
   <w:num w:numId="12" w16cid:durableId="1443918750">
-    <w:abstractNumId w:val="36"/>
+    <w:abstractNumId w:val="37"/>
   </w:num>
   <w:num w:numId="13" w16cid:durableId="165675536">
-    <w:abstractNumId w:val="14"/>
+    <w:abstractNumId w:val="15"/>
   </w:num>
   <w:num w:numId="14" w16cid:durableId="334069376">
-    <w:abstractNumId w:val="26"/>
+    <w:abstractNumId w:val="27"/>
   </w:num>
   <w:num w:numId="15" w16cid:durableId="886575275">
-    <w:abstractNumId w:val="12"/>
+    <w:abstractNumId w:val="13"/>
   </w:num>
   <w:num w:numId="16" w16cid:durableId="1592424843">
     <w:abstractNumId w:val="4"/>
   </w:num>
   <w:num w:numId="17" w16cid:durableId="1975334189">
-    <w:abstractNumId w:val="30"/>
+    <w:abstractNumId w:val="31"/>
   </w:num>
   <w:num w:numId="18" w16cid:durableId="2123374503">
     <w:abstractNumId w:val="0"/>
   </w:num>
   <w:num w:numId="19" w16cid:durableId="2108037336">
-    <w:abstractNumId w:val="32"/>
+    <w:abstractNumId w:val="33"/>
   </w:num>
   <w:num w:numId="20" w16cid:durableId="529757510">
-    <w:abstractNumId w:val="29"/>
+    <w:abstractNumId w:val="30"/>
   </w:num>
   <w:num w:numId="21" w16cid:durableId="1079903671">
-    <w:abstractNumId w:val="45"/>
+    <w:abstractNumId w:val="46"/>
   </w:num>
   <w:num w:numId="22" w16cid:durableId="1206714453">
-    <w:abstractNumId w:val="39"/>
+    <w:abstractNumId w:val="40"/>
   </w:num>
   <w:num w:numId="23" w16cid:durableId="184103881">
-    <w:abstractNumId w:val="42"/>
+    <w:abstractNumId w:val="43"/>
   </w:num>
   <w:num w:numId="24" w16cid:durableId="428081677">
-    <w:abstractNumId w:val="33"/>
+    <w:abstractNumId w:val="34"/>
   </w:num>
   <w:num w:numId="25" w16cid:durableId="1529219058">
     <w:abstractNumId w:val="1"/>
   </w:num>
   <w:num w:numId="26" w16cid:durableId="629944919">
-    <w:abstractNumId w:val="19"/>
+    <w:abstractNumId w:val="20"/>
   </w:num>
   <w:num w:numId="27" w16cid:durableId="1331526280">
     <w:abstractNumId w:val="5"/>
   </w:num>
   <w:num w:numId="28" w16cid:durableId="1840777965">
-    <w:abstractNumId w:val="24"/>
+    <w:abstractNumId w:val="25"/>
   </w:num>
   <w:num w:numId="29" w16cid:durableId="1803227406">
     <w:abstractNumId w:val="2"/>
   </w:num>
   <w:num w:numId="30" w16cid:durableId="1608536317">
-    <w:abstractNumId w:val="22"/>
+    <w:abstractNumId w:val="23"/>
   </w:num>
   <w:num w:numId="31" w16cid:durableId="620310145">
-    <w:abstractNumId w:val="38"/>
+    <w:abstractNumId w:val="39"/>
   </w:num>
   <w:num w:numId="32" w16cid:durableId="1594974264">
-    <w:abstractNumId w:val="9"/>
+    <w:abstractNumId w:val="10"/>
   </w:num>
   <w:num w:numId="33" w16cid:durableId="149643108">
-    <w:abstractNumId w:val="23"/>
+    <w:abstractNumId w:val="24"/>
   </w:num>
   <w:num w:numId="34" w16cid:durableId="938178687">
-    <w:abstractNumId w:val="44"/>
+    <w:abstractNumId w:val="45"/>
   </w:num>
   <w:num w:numId="35" w16cid:durableId="694888852">
-    <w:abstractNumId w:val="35"/>
+    <w:abstractNumId w:val="36"/>
   </w:num>
   <w:num w:numId="36" w16cid:durableId="711228517">
-    <w:abstractNumId w:val="17"/>
+    <w:abstractNumId w:val="18"/>
   </w:num>
   <w:num w:numId="37" w16cid:durableId="1712875430">
-    <w:abstractNumId w:val="48"/>
+    <w:abstractNumId w:val="49"/>
   </w:num>
   <w:num w:numId="38" w16cid:durableId="1801067558">
-    <w:abstractNumId w:val="13"/>
+    <w:abstractNumId w:val="14"/>
   </w:num>
   <w:num w:numId="39" w16cid:durableId="1228106953">
-    <w:abstractNumId w:val="10"/>
+    <w:abstractNumId w:val="11"/>
   </w:num>
   <w:num w:numId="40" w16cid:durableId="1884711127">
-    <w:abstractNumId w:val="27"/>
+    <w:abstractNumId w:val="28"/>
   </w:num>
   <w:num w:numId="41" w16cid:durableId="1541281196">
     <w:abstractNumId w:val="8"/>
   </w:num>
   <w:num w:numId="42" w16cid:durableId="920286904">
-    <w:abstractNumId w:val="18"/>
+    <w:abstractNumId w:val="19"/>
   </w:num>
   <w:num w:numId="43" w16cid:durableId="2048022164">
-    <w:abstractNumId w:val="25"/>
+    <w:abstractNumId w:val="26"/>
   </w:num>
   <w:num w:numId="44" w16cid:durableId="2100564922">
-    <w:abstractNumId w:val="20"/>
+    <w:abstractNumId w:val="21"/>
   </w:num>
   <w:num w:numId="45" w16cid:durableId="2056273990">
-    <w:abstractNumId w:val="46"/>
+    <w:abstractNumId w:val="47"/>
   </w:num>
   <w:num w:numId="46" w16cid:durableId="1587688390">
     <w:abstractNumId w:val="6"/>
   </w:num>
   <w:num w:numId="47" w16cid:durableId="360520222">
-    <w:abstractNumId w:val="41"/>
+    <w:abstractNumId w:val="42"/>
   </w:num>
   <w:num w:numId="48" w16cid:durableId="709231794">
     <w:abstractNumId w:val="3"/>
   </w:num>
   <w:num w:numId="49" w16cid:durableId="236789935">
-    <w:abstractNumId w:val="31"/>
+    <w:abstractNumId w:val="32"/>
+  </w:num>
+  <w:num w:numId="50" w16cid:durableId="192573658">
+    <w:abstractNumId w:val="9"/>
   </w:num>
 </w:numbering>
 </file>

</xml_diff>

<commit_message>
Added Francini's contributions to the main doc with some minor modifications.
</commit_message>
<xml_diff>
--- a/docs/Project Plan.docx
+++ b/docs/Project Plan.docx
@@ -9,7 +9,7 @@
           <w:noProof/>
         </w:rPr>
         <mc:AlternateContent>
-          <mc:Choice Requires="wpg">
+          <mc:Choice Requires="wps">
             <w:drawing>
               <wp:anchor distT="0" distB="0" distL="182880" distR="182880" simplePos="0" relativeHeight="251658240" behindDoc="0" locked="0" layoutInCell="1" hidden="0" allowOverlap="1" wp14:anchorId="28E3F3B4" wp14:editId="28E3F3B5">
                 <wp:simplePos x="0" y="0"/>
@@ -97,47 +97,59 @@
               </wp:anchor>
             </w:drawing>
           </mc:Choice>
-          <mc:Fallback xmlns:cr="http://schemas.microsoft.com/office/comments/2020/reactions" xmlns="http://schemas.microsoft.com/office/tasks/2019/documenttasks" xmlns:dgm="http://schemas.openxmlformats.org/drawingml/2006/diagram" xmlns:lc="http://schemas.openxmlformats.org/drawingml/2006/lockedCanvas" xmlns:c="http://schemas.openxmlformats.org/drawingml/2006/chart" xmlns:pic="http://schemas.openxmlformats.org/drawingml/2006/picture" xmlns:a="http://schemas.openxmlformats.org/drawingml/2006/main" xmlns:sl="http://schemas.openxmlformats.org/schemaLibrary/2006/main">
-            <w:drawing>
-              <wp:anchor allowOverlap="1" behindDoc="0" distB="0" distT="0" distL="182880" distR="182880" hidden="0" layoutInCell="1" locked="0" relativeHeight="0" simplePos="0">
-                <wp:simplePos x="0" y="0"/>
-                <wp:positionH relativeFrom="margin">
-                  <wp:posOffset>452438</wp:posOffset>
-                </wp:positionH>
-                <wp:positionV relativeFrom="page">
-                  <wp:posOffset>3338513</wp:posOffset>
-                </wp:positionV>
-                <wp:extent cx="4772025" cy="3877945"/>
-                <wp:effectExtent b="0" l="0" r="0" t="0"/>
-                <wp:wrapSquare wrapText="bothSides" distB="0" distT="0" distL="182880" distR="182880"/>
-                <wp:docPr id="132" name="image1.png"/>
-                <a:graphic>
-                  <a:graphicData uri="http://schemas.openxmlformats.org/drawingml/2006/picture">
-                    <pic:pic>
-                      <pic:nvPicPr>
-                        <pic:cNvPr id="0" name="image1.png"/>
-                        <pic:cNvPicPr preferRelativeResize="0"/>
-                      </pic:nvPicPr>
-                      <pic:blipFill>
-                        <a:blip r:embed="rId7"/>
-                        <a:srcRect/>
-                        <a:stretch>
-                          <a:fillRect/>
-                        </a:stretch>
-                      </pic:blipFill>
-                      <pic:spPr>
-                        <a:xfrm>
-                          <a:off x="0" y="0"/>
-                          <a:ext cx="4772025" cy="3877945"/>
-                        </a:xfrm>
-                        <a:prstGeom prst="rect"/>
-                        <a:ln/>
-                      </pic:spPr>
-                    </pic:pic>
-                  </a:graphicData>
-                </a:graphic>
-              </wp:anchor>
-            </w:drawing>
+          <mc:Fallback>
+            <w:pict>
+              <v:rect w14:anchorId="28E3F3B4" id="Rectangle 132" o:spid="_x0000_s1026" style="position:absolute;margin-left:35.65pt;margin-top:262.9pt;width:375.75pt;height:305.35pt;z-index:251658240;visibility:visible;mso-wrap-style:square;mso-wrap-distance-left:14.4pt;mso-wrap-distance-top:0;mso-wrap-distance-right:14.4pt;mso-wrap-distance-bottom:0;mso-position-horizontal:absolute;mso-position-horizontal-relative:margin;mso-position-vertical:absolute;mso-position-vertical-relative:page;v-text-anchor:top" o:gfxdata="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" filled="f" stroked="f">
+                <v:textbox inset="0,0,0,0">
+                  <w:txbxContent>
+                    <w:p>
+                      <w:pPr>
+                        <w:spacing w:before="40" w:after="560" w:line="215" w:lineRule="auto"/>
+                        <w:textDirection w:val="btLr"/>
+                      </w:pPr>
+                      <w:r>
+                        <w:rPr>
+                          <w:rFonts w:ascii="Arial" w:eastAsia="Arial" w:hAnsi="Arial" w:cs="Arial"/>
+                          <w:color w:val="156082"/>
+                          <w:sz w:val="72"/>
+                        </w:rPr>
+                        <w:t>CMSC 495 Theory and Design</w:t>
+                      </w:r>
+                    </w:p>
+                    <w:p>
+                      <w:pPr>
+                        <w:spacing w:before="40" w:after="40" w:line="240" w:lineRule="auto"/>
+                        <w:textDirection w:val="btLr"/>
+                      </w:pPr>
+                      <w:r>
+                        <w:rPr>
+                          <w:rFonts w:ascii="Arial" w:eastAsia="Arial" w:hAnsi="Arial" w:cs="Arial"/>
+                          <w:smallCaps/>
+                          <w:color w:val="501549"/>
+                          <w:sz w:val="28"/>
+                        </w:rPr>
+                        <w:t>BREAKOUT GAME IN C++</w:t>
+                      </w:r>
+                    </w:p>
+                    <w:p>
+                      <w:pPr>
+                        <w:spacing w:before="80" w:after="40" w:line="240" w:lineRule="auto"/>
+                        <w:textDirection w:val="btLr"/>
+                      </w:pPr>
+                      <w:r>
+                        <w:rPr>
+                          <w:rFonts w:ascii="Arial" w:eastAsia="Arial" w:hAnsi="Arial" w:cs="Arial"/>
+                          <w:smallCaps/>
+                          <w:color w:val="A02B93"/>
+                        </w:rPr>
+                        <w:t>TEAM MEMBERS: ETHAN WASNIAK, BRENDAN LAIRD, STEVEN DICKINSON, KENISE BALTON, FRANCINI CLEMMONS</w:t>
+                      </w:r>
+                    </w:p>
+                  </w:txbxContent>
+                </v:textbox>
+                <w10:wrap type="square" anchorx="margin" anchory="page"/>
+              </v:rect>
+            </w:pict>
           </mc:Fallback>
         </mc:AlternateContent>
       </w:r>
@@ -220,10 +232,15 @@
         <w:ind w:firstLine="720"/>
       </w:pPr>
       <w:r>
-        <w:t>The Breakout Game in C++ project involves the design and development of a standalone 2D arcade-style application that recreates the core mechanics of the classic Breakout game. The system centers around player interaction with a paddle to control the trajectory of a moving ball, with the objective of destroying a grid of bricks while preventing the ball from leaving the play area. The application will be implemented in C++ using an appropriate graphics/game development library, and will run as a desktop-bas</w:t>
-      </w:r>
-      <w:r>
-        <w:t>ed program.</w:t>
+        <w:t xml:space="preserve">The Breakout Game in C++ project involves the design and development of a standalone 2D arcade-style application that recreates the core mechanics of the classic Breakout game. The system centers around player interaction with a paddle to control the trajectory of a moving ball, with the objective of destroying a grid of bricks while preventing the ball from leaving the play area. The application will be implemented in C++ using an appropriate graphics/game development </w:t>
+      </w:r>
+      <w:proofErr w:type="gramStart"/>
+      <w:r>
+        <w:t>library, and</w:t>
+      </w:r>
+      <w:proofErr w:type="gramEnd"/>
+      <w:r>
+        <w:t xml:space="preserve"> will run as a desktop-based program.</w:t>
       </w:r>
     </w:p>
     <w:p>
@@ -284,6 +301,7 @@
     <w:p>
       <w:pPr>
         <w:spacing w:after="0"/>
+        <w:ind w:firstLine="720"/>
       </w:pPr>
     </w:p>
     <w:p>
@@ -298,6 +316,7 @@
     <w:p>
       <w:pPr>
         <w:spacing w:after="0"/>
+        <w:ind w:firstLine="720"/>
       </w:pPr>
     </w:p>
     <w:p>
@@ -306,7 +325,15 @@
         <w:ind w:firstLine="720"/>
       </w:pPr>
       <w:r>
-        <w:t xml:space="preserve">The project further aims to implement the core gameplay systems in a structured and incremental manner. These systems include the game window and main loop, paddle input and movement, ball motion and boundary interaction, brick grid management, and collision handling between gameplay elements. These features represent the minimum </w:t>
+        <w:t xml:space="preserve">The </w:t>
+      </w:r>
+      <w:proofErr w:type="gramStart"/>
+      <w:r>
+        <w:t>project further</w:t>
+      </w:r>
+      <w:proofErr w:type="gramEnd"/>
+      <w:r>
+        <w:t xml:space="preserve"> aims to implement the core gameplay systems in a structured and incremental manner. These systems include the game window and main loop, paddle input and movement, ball motion and boundary interaction, brick grid management, and collision handling between gameplay elements. These features represent the minimum </w:t>
       </w:r>
       <w:r>
         <w:lastRenderedPageBreak/>
@@ -357,18 +384,6 @@
     </w:p>
     <w:p>
       <w:pPr>
-        <w:pBdr>
-          <w:top w:val="nil"/>
-          <w:left w:val="nil"/>
-          <w:bottom w:val="nil"/>
-          <w:right w:val="nil"/>
-          <w:between w:val="nil"/>
-        </w:pBdr>
-        <w:spacing w:after="0"/>
-      </w:pPr>
-    </w:p>
-    <w:p>
-      <w:pPr>
         <w:pStyle w:val="Heading1"/>
       </w:pPr>
       <w:r>
@@ -430,7 +445,6 @@
         <w:t xml:space="preserve">Some additional features that could be implemented but are out of scope for the initial project, if the time and resources are available, would be a leader board for high scores for each level, but that would only be implemented after extensive testing of the in-scope requirements. Additional out-of-scope portions would be enabling multiplayer, as that would involve a massive increase in the effort and time required in the somewhat limited amount of time that we have. </w:t>
       </w:r>
     </w:p>
-    <w:p/>
     <w:p>
       <w:pPr>
         <w:pStyle w:val="Heading1"/>
@@ -440,6 +454,11 @@
       </w:r>
     </w:p>
     <w:p>
+      <w:pPr>
+        <w:rPr>
+          <w:u w:val="single"/>
+        </w:rPr>
+      </w:pPr>
       <w:r>
         <w:rPr>
           <w:u w:val="single"/>
@@ -447,118 +466,218 @@
         <w:t>Team Members and Roles:</w:t>
       </w:r>
     </w:p>
-    <w:p>
-      <w:pPr>
-        <w:numPr>
-          <w:ilvl w:val="0"/>
-          <w:numId w:val="3"/>
-        </w:numPr>
-        <w:pBdr>
-          <w:top w:val="nil"/>
-          <w:left w:val="nil"/>
-          <w:bottom w:val="nil"/>
-          <w:right w:val="nil"/>
-          <w:between w:val="nil"/>
-        </w:pBdr>
-        <w:spacing w:after="0"/>
-      </w:pPr>
-      <w:r>
+    <w:tbl>
+      <w:tblPr>
+        <w:tblStyle w:val="TableGrid"/>
+        <w:tblW w:w="0" w:type="auto"/>
+        <w:tblLook w:val="04A0" w:firstRow="1" w:lastRow="0" w:firstColumn="1" w:lastColumn="0" w:noHBand="0" w:noVBand="1"/>
+      </w:tblPr>
+      <w:tblGrid>
+        <w:gridCol w:w="3116"/>
+        <w:gridCol w:w="3117"/>
+        <w:gridCol w:w="3117"/>
+      </w:tblGrid>
+      <w:tr>
+        <w:tc>
+          <w:tcPr>
+            <w:tcW w:w="3116" w:type="dxa"/>
+          </w:tcPr>
+          <w:p>
+            <w:pPr>
+              <w:rPr>
+                <w:b/>
+                <w:bCs/>
+              </w:rPr>
+            </w:pPr>
+            <w:r>
+              <w:rPr>
+                <w:b/>
+                <w:bCs/>
+              </w:rPr>
+              <w:t>Team Member</w:t>
+            </w:r>
+          </w:p>
+        </w:tc>
+        <w:tc>
+          <w:tcPr>
+            <w:tcW w:w="3117" w:type="dxa"/>
+          </w:tcPr>
+          <w:p>
+            <w:pPr>
+              <w:rPr>
+                <w:b/>
+                <w:bCs/>
+              </w:rPr>
+            </w:pPr>
+            <w:r>
+              <w:rPr>
+                <w:b/>
+                <w:bCs/>
+              </w:rPr>
+              <w:t>Role</w:t>
+            </w:r>
+          </w:p>
+        </w:tc>
+        <w:tc>
+          <w:tcPr>
+            <w:tcW w:w="3117" w:type="dxa"/>
+          </w:tcPr>
+          <w:p>
+            <w:pPr>
+              <w:rPr>
+                <w:b/>
+                <w:bCs/>
+              </w:rPr>
+            </w:pPr>
+            <w:r>
+              <w:rPr>
+                <w:b/>
+                <w:bCs/>
+              </w:rPr>
+              <w:t>Resp</w:t>
+            </w:r>
+            <w:r>
+              <w:rPr>
+                <w:b/>
+                <w:bCs/>
+              </w:rPr>
+              <w:t>onsibility</w:t>
+            </w:r>
+          </w:p>
+        </w:tc>
+      </w:tr>
+      <w:tr>
+        <w:tc>
+          <w:tcPr>
+            <w:tcW w:w="3116" w:type="dxa"/>
+          </w:tcPr>
+          <w:p>
+            <w:r>
+              <w:t>Brenden Laird</w:t>
+            </w:r>
+          </w:p>
+        </w:tc>
+        <w:tc>
+          <w:tcPr>
+            <w:tcW w:w="3117" w:type="dxa"/>
+          </w:tcPr>
+          <w:p/>
+        </w:tc>
+        <w:tc>
+          <w:tcPr>
+            <w:tcW w:w="3117" w:type="dxa"/>
+          </w:tcPr>
+          <w:p/>
+        </w:tc>
+      </w:tr>
+      <w:tr>
+        <w:tc>
+          <w:tcPr>
+            <w:tcW w:w="3116" w:type="dxa"/>
+          </w:tcPr>
+          <w:p>
+            <w:r>
+              <w:t>Ethan Wasniak</w:t>
+            </w:r>
+          </w:p>
+        </w:tc>
+        <w:tc>
+          <w:tcPr>
+            <w:tcW w:w="3117" w:type="dxa"/>
+          </w:tcPr>
+          <w:p/>
+        </w:tc>
+        <w:tc>
+          <w:tcPr>
+            <w:tcW w:w="3117" w:type="dxa"/>
+          </w:tcPr>
+          <w:p/>
+        </w:tc>
+      </w:tr>
+      <w:tr>
+        <w:tc>
+          <w:tcPr>
+            <w:tcW w:w="3116" w:type="dxa"/>
+          </w:tcPr>
+          <w:p>
+            <w:r>
+              <w:t>Steve Dickinson</w:t>
+            </w:r>
+          </w:p>
+        </w:tc>
+        <w:tc>
+          <w:tcPr>
+            <w:tcW w:w="3117" w:type="dxa"/>
+          </w:tcPr>
+          <w:p/>
+        </w:tc>
+        <w:tc>
+          <w:tcPr>
+            <w:tcW w:w="3117" w:type="dxa"/>
+          </w:tcPr>
+          <w:p/>
+        </w:tc>
+      </w:tr>
+      <w:tr>
+        <w:tc>
+          <w:tcPr>
+            <w:tcW w:w="3116" w:type="dxa"/>
+          </w:tcPr>
+          <w:p>
+            <w:r>
+              <w:t>Francini Clemmons</w:t>
+            </w:r>
+          </w:p>
+        </w:tc>
+        <w:tc>
+          <w:tcPr>
+            <w:tcW w:w="3117" w:type="dxa"/>
+          </w:tcPr>
+          <w:p/>
+        </w:tc>
+        <w:tc>
+          <w:tcPr>
+            <w:tcW w:w="3117" w:type="dxa"/>
+          </w:tcPr>
+          <w:p/>
+        </w:tc>
+      </w:tr>
+      <w:tr>
+        <w:tc>
+          <w:tcPr>
+            <w:tcW w:w="3116" w:type="dxa"/>
+          </w:tcPr>
+          <w:p>
+            <w:r>
+              <w:t>Kenise Balton</w:t>
+            </w:r>
+          </w:p>
+        </w:tc>
+        <w:tc>
+          <w:tcPr>
+            <w:tcW w:w="3117" w:type="dxa"/>
+          </w:tcPr>
+          <w:p/>
+        </w:tc>
+        <w:tc>
+          <w:tcPr>
+            <w:tcW w:w="3117" w:type="dxa"/>
+          </w:tcPr>
+          <w:p/>
+        </w:tc>
+      </w:tr>
+    </w:tbl>
+    <w:p>
+      <w:pPr>
+        <w:ind w:firstLine="360"/>
         <w:rPr>
           <w:color w:val="000000"/>
         </w:rPr>
-        <w:t>Ethan Wasniak:</w:t>
-      </w:r>
-    </w:p>
-    <w:p>
-      <w:pPr>
-        <w:numPr>
-          <w:ilvl w:val="0"/>
-          <w:numId w:val="3"/>
-        </w:numPr>
-        <w:pBdr>
-          <w:top w:val="nil"/>
-          <w:left w:val="nil"/>
-          <w:bottom w:val="nil"/>
-          <w:right w:val="nil"/>
-          <w:between w:val="nil"/>
-        </w:pBdr>
-        <w:spacing w:after="0"/>
-      </w:pPr>
-      <w:r>
-        <w:rPr>
-          <w:color w:val="000000"/>
-        </w:rPr>
-        <w:t>Brendan Laird:</w:t>
-      </w:r>
-    </w:p>
-    <w:p>
-      <w:pPr>
-        <w:numPr>
-          <w:ilvl w:val="0"/>
-          <w:numId w:val="3"/>
-        </w:numPr>
-        <w:pBdr>
-          <w:top w:val="nil"/>
-          <w:left w:val="nil"/>
-          <w:bottom w:val="nil"/>
-          <w:right w:val="nil"/>
-          <w:between w:val="nil"/>
-        </w:pBdr>
-        <w:spacing w:after="0"/>
-      </w:pPr>
-      <w:r>
-        <w:rPr>
-          <w:color w:val="000000"/>
-        </w:rPr>
-        <w:t>Steven Dickinson:</w:t>
-      </w:r>
-    </w:p>
-    <w:p>
-      <w:pPr>
-        <w:numPr>
-          <w:ilvl w:val="0"/>
-          <w:numId w:val="3"/>
-        </w:numPr>
-        <w:pBdr>
-          <w:top w:val="nil"/>
-          <w:left w:val="nil"/>
-          <w:bottom w:val="nil"/>
-          <w:right w:val="nil"/>
-          <w:between w:val="nil"/>
-        </w:pBdr>
-        <w:spacing w:after="0"/>
-      </w:pPr>
-      <w:r>
-        <w:rPr>
-          <w:color w:val="000000"/>
-        </w:rPr>
-        <w:t>Kenise Balton:</w:t>
-      </w:r>
-    </w:p>
-    <w:p>
-      <w:pPr>
-        <w:numPr>
-          <w:ilvl w:val="0"/>
-          <w:numId w:val="3"/>
-        </w:numPr>
-        <w:pBdr>
-          <w:top w:val="nil"/>
-          <w:left w:val="nil"/>
-          <w:bottom w:val="nil"/>
-          <w:right w:val="nil"/>
-          <w:between w:val="nil"/>
-        </w:pBdr>
-      </w:pPr>
-      <w:r>
-        <w:rPr>
-          <w:color w:val="000000"/>
-        </w:rPr>
-        <w:t>Francini Clemmons:</w:t>
-      </w:r>
-    </w:p>
-    <w:p>
-      <w:pPr>
-        <w:ind w:firstLine="720"/>
+      </w:pPr>
+    </w:p>
+    <w:p>
+      <w:pPr>
+        <w:ind w:firstLine="360"/>
       </w:pPr>
       <w:r>
         <w:t xml:space="preserve">The programming language that will be used for the majority of this project will be C++. The libraries being used will be </w:t>
@@ -605,7 +724,7 @@
         <w:pStyle w:val="Heading1"/>
       </w:pPr>
       <w:r>
-        <w:t>Risk Management (Optional but Recommended for "Exceeds")</w:t>
+        <w:t>Risk Management</w:t>
       </w:r>
     </w:p>
     <w:p>
@@ -713,7 +832,15 @@
         <w:t xml:space="preserve">it should be committed to the repo for others to use as soon as possible. This should allow for </w:t>
       </w:r>
       <w:r>
-        <w:t xml:space="preserve">there to be minimal merge </w:t>
+        <w:t xml:space="preserve">there to be minimal </w:t>
+      </w:r>
+      <w:proofErr w:type="gramStart"/>
+      <w:r>
+        <w:t>merge</w:t>
+      </w:r>
+      <w:proofErr w:type="gramEnd"/>
+      <w:r>
+        <w:t xml:space="preserve"> </w:t>
       </w:r>
       <w:r>
         <w:t>conflicts</w:t>
@@ -741,78 +868,133 @@
           <w:between w:val="nil"/>
         </w:pBdr>
         <w:ind w:firstLine="720"/>
-        <w:rPr>
-          <w:i/>
-          <w:iCs/>
-        </w:rPr>
-      </w:pPr>
-      <w:r>
-        <w:rPr>
-          <w:i/>
-          <w:iCs/>
-        </w:rPr>
-        <w:t>[Haven’t discussed this yet, but maybe put something about learning basics of c++ or of libraries that are being used.]</w:t>
-      </w:r>
+      </w:pPr>
+      <w:r>
+        <w:t xml:space="preserve">There is varied experience in the c++ </w:t>
+      </w:r>
+      <w:r>
+        <w:t>programming language</w:t>
+      </w:r>
+      <w:r>
+        <w:t xml:space="preserve"> </w:t>
+      </w:r>
+      <w:r>
+        <w:t xml:space="preserve">so there should be some time set aside for </w:t>
+      </w:r>
+      <w:r>
+        <w:t>the members of the team to become more familiar with the c++ language and ou</w:t>
+      </w:r>
+      <w:r>
+        <w:t>r chosen GUI library so that all members of the team can</w:t>
+      </w:r>
+      <w:r>
+        <w:t xml:space="preserve"> </w:t>
+      </w:r>
+      <w:r>
+        <w:t xml:space="preserve">more easily </w:t>
+      </w:r>
+      <w:r>
+        <w:t xml:space="preserve">contribute </w:t>
+      </w:r>
+      <w:proofErr w:type="gramStart"/>
+      <w:r>
+        <w:t>in</w:t>
+      </w:r>
+      <w:proofErr w:type="gramEnd"/>
+      <w:r>
+        <w:t xml:space="preserve"> the development of the project.</w:t>
+      </w:r>
+    </w:p>
+    <w:p>
+      <w:pPr>
+        <w:pBdr>
+          <w:top w:val="nil"/>
+          <w:left w:val="nil"/>
+          <w:bottom w:val="nil"/>
+          <w:right w:val="nil"/>
+          <w:between w:val="nil"/>
+        </w:pBdr>
+        <w:ind w:firstLine="720"/>
+      </w:pPr>
     </w:p>
     <w:p>
       <w:pPr>
         <w:pStyle w:val="Heading1"/>
       </w:pPr>
       <w:r>
+        <w:lastRenderedPageBreak/>
         <w:t>Schedule and Milestones</w:t>
       </w:r>
     </w:p>
     <w:tbl>
       <w:tblPr>
-        <w:tblStyle w:val="a"/>
-        <w:tblW w:w="9350" w:type="dxa"/>
-        <w:tblBorders>
-          <w:top w:val="single" w:sz="4" w:space="0" w:color="000000"/>
-          <w:left w:val="single" w:sz="4" w:space="0" w:color="000000"/>
-          <w:bottom w:val="single" w:sz="4" w:space="0" w:color="000000"/>
-          <w:right w:val="single" w:sz="4" w:space="0" w:color="000000"/>
-          <w:insideH w:val="single" w:sz="4" w:space="0" w:color="000000"/>
-          <w:insideV w:val="single" w:sz="4" w:space="0" w:color="000000"/>
-        </w:tblBorders>
-        <w:tblLayout w:type="fixed"/>
-        <w:tblLook w:val="0400" w:firstRow="0" w:lastRow="0" w:firstColumn="0" w:lastColumn="0" w:noHBand="0" w:noVBand="1"/>
+        <w:tblStyle w:val="TableGrid"/>
+        <w:tblW w:w="10255" w:type="dxa"/>
+        <w:tblLook w:val="04A0" w:firstRow="1" w:lastRow="0" w:firstColumn="1" w:lastColumn="0" w:noHBand="0" w:noVBand="1"/>
       </w:tblPr>
       <w:tblGrid>
-        <w:gridCol w:w="1885"/>
-        <w:gridCol w:w="5040"/>
-        <w:gridCol w:w="2425"/>
+        <w:gridCol w:w="1975"/>
+        <w:gridCol w:w="3420"/>
+        <w:gridCol w:w="4860"/>
       </w:tblGrid>
       <w:tr>
         <w:tc>
           <w:tcPr>
-            <w:tcW w:w="1885" w:type="dxa"/>
-          </w:tcPr>
-          <w:p>
-            <w:r>
-              <w:t>P</w:t>
-            </w:r>
-            <w:r>
-              <w:t>hase</w:t>
-            </w:r>
-          </w:p>
-        </w:tc>
-        <w:tc>
-          <w:tcPr>
-            <w:tcW w:w="5040" w:type="dxa"/>
-          </w:tcPr>
-          <w:p>
-            <w:r>
-              <w:t>Milestone</w:t>
-            </w:r>
-          </w:p>
-        </w:tc>
-        <w:tc>
-          <w:tcPr>
-            <w:tcW w:w="2425" w:type="dxa"/>
-          </w:tcPr>
-          <w:p>
-            <w:r>
-              <w:t>Target Date</w:t>
+            <w:tcW w:w="1975" w:type="dxa"/>
+          </w:tcPr>
+          <w:p>
+            <w:pPr>
+              <w:rPr>
+                <w:b/>
+                <w:bCs/>
+              </w:rPr>
+            </w:pPr>
+            <w:r>
+              <w:rPr>
+                <w:b/>
+                <w:bCs/>
+              </w:rPr>
+              <w:t>Week #</w:t>
+            </w:r>
+          </w:p>
+        </w:tc>
+        <w:tc>
+          <w:tcPr>
+            <w:tcW w:w="3420" w:type="dxa"/>
+          </w:tcPr>
+          <w:p>
+            <w:pPr>
+              <w:rPr>
+                <w:b/>
+                <w:bCs/>
+              </w:rPr>
+            </w:pPr>
+            <w:r>
+              <w:rPr>
+                <w:b/>
+                <w:bCs/>
+              </w:rPr>
+              <w:t>Task/Milestone/Deliverables</w:t>
+            </w:r>
+          </w:p>
+        </w:tc>
+        <w:tc>
+          <w:tcPr>
+            <w:tcW w:w="4860" w:type="dxa"/>
+          </w:tcPr>
+          <w:p>
+            <w:pPr>
+              <w:rPr>
+                <w:b/>
+                <w:bCs/>
+              </w:rPr>
+            </w:pPr>
+            <w:r>
+              <w:rPr>
+                <w:b/>
+                <w:bCs/>
+              </w:rPr>
+              <w:t>Goals</w:t>
             </w:r>
           </w:p>
         </w:tc>
@@ -820,227 +1002,340 @@
       <w:tr>
         <w:tc>
           <w:tcPr>
-            <w:tcW w:w="1885" w:type="dxa"/>
-          </w:tcPr>
-          <w:p>
-            <w:pPr>
-              <w:numPr>
-                <w:ilvl w:val="0"/>
-                <w:numId w:val="2"/>
-              </w:numPr>
-              <w:pBdr>
-                <w:top w:val="nil"/>
-                <w:left w:val="nil"/>
-                <w:bottom w:val="nil"/>
-                <w:right w:val="nil"/>
-                <w:between w:val="nil"/>
-              </w:pBdr>
-              <w:spacing w:after="160" w:line="278" w:lineRule="auto"/>
-            </w:pPr>
-            <w:r>
-              <w:rPr>
-                <w:color w:val="000000"/>
-              </w:rPr>
-              <w:lastRenderedPageBreak/>
-              <w:t>Planning</w:t>
-            </w:r>
-          </w:p>
-        </w:tc>
-        <w:tc>
-          <w:tcPr>
-            <w:tcW w:w="5040" w:type="dxa"/>
-          </w:tcPr>
-          <w:p>
-            <w:r>
-              <w:t>Project Plan &amp; Requirements Finalized</w:t>
-            </w:r>
-          </w:p>
-        </w:tc>
-        <w:tc>
-          <w:tcPr>
-            <w:tcW w:w="2425" w:type="dxa"/>
-          </w:tcPr>
-          <w:p/>
+            <w:tcW w:w="1975" w:type="dxa"/>
+          </w:tcPr>
+          <w:p>
+            <w:r>
+              <w:t xml:space="preserve">1: 03/11 – 03/17 </w:t>
+            </w:r>
+          </w:p>
+        </w:tc>
+        <w:tc>
+          <w:tcPr>
+            <w:tcW w:w="3420" w:type="dxa"/>
+          </w:tcPr>
+          <w:p>
+            <w:r>
+              <w:t>Project Setup &amp; Team Building</w:t>
+            </w:r>
+          </w:p>
+        </w:tc>
+        <w:tc>
+          <w:tcPr>
+            <w:tcW w:w="4860" w:type="dxa"/>
+          </w:tcPr>
+          <w:p>
+            <w:r>
+              <w:t xml:space="preserve">Get team together and determine some project </w:t>
+            </w:r>
+            <w:r>
+              <w:t>specifics.</w:t>
+            </w:r>
+          </w:p>
         </w:tc>
       </w:tr>
       <w:tr>
         <w:tc>
           <w:tcPr>
-            <w:tcW w:w="1885" w:type="dxa"/>
-          </w:tcPr>
-          <w:p>
-            <w:pPr>
-              <w:numPr>
-                <w:ilvl w:val="0"/>
-                <w:numId w:val="2"/>
-              </w:numPr>
-              <w:pBdr>
-                <w:top w:val="nil"/>
-                <w:left w:val="nil"/>
-                <w:bottom w:val="nil"/>
-                <w:right w:val="nil"/>
-                <w:between w:val="nil"/>
-              </w:pBdr>
-              <w:spacing w:after="160" w:line="278" w:lineRule="auto"/>
-            </w:pPr>
-            <w:r>
-              <w:rPr>
-                <w:color w:val="000000"/>
-              </w:rPr>
-              <w:t>Design</w:t>
-            </w:r>
-          </w:p>
-        </w:tc>
-        <w:tc>
-          <w:tcPr>
-            <w:tcW w:w="5040" w:type="dxa"/>
-          </w:tcPr>
-          <w:p>
-            <w:r>
-              <w:t>GUI Mockups &amp; Class Diagrams Complete</w:t>
-            </w:r>
-          </w:p>
-        </w:tc>
-        <w:tc>
-          <w:tcPr>
-            <w:tcW w:w="2425" w:type="dxa"/>
-          </w:tcPr>
-          <w:p/>
+            <w:tcW w:w="1975" w:type="dxa"/>
+          </w:tcPr>
+          <w:p>
+            <w:r>
+              <w:t>2: 03/18 – 03/24</w:t>
+            </w:r>
+          </w:p>
+        </w:tc>
+        <w:tc>
+          <w:tcPr>
+            <w:tcW w:w="3420" w:type="dxa"/>
+          </w:tcPr>
+          <w:p>
+            <w:r>
+              <w:t>Project Plan</w:t>
+            </w:r>
+          </w:p>
+        </w:tc>
+        <w:tc>
+          <w:tcPr>
+            <w:tcW w:w="4860" w:type="dxa"/>
+          </w:tcPr>
+          <w:p>
+            <w:r>
+              <w:t>Develop a plan for</w:t>
+            </w:r>
+            <w:r>
+              <w:t xml:space="preserve"> development of project. Finalize </w:t>
+            </w:r>
+            <w:r>
+              <w:t>what resources are being used. Define teammate roles.</w:t>
+            </w:r>
+          </w:p>
         </w:tc>
       </w:tr>
       <w:tr>
         <w:tc>
           <w:tcPr>
-            <w:tcW w:w="1885" w:type="dxa"/>
-          </w:tcPr>
-          <w:p>
-            <w:pPr>
-              <w:numPr>
-                <w:ilvl w:val="0"/>
-                <w:numId w:val="2"/>
-              </w:numPr>
-              <w:pBdr>
-                <w:top w:val="nil"/>
-                <w:left w:val="nil"/>
-                <w:bottom w:val="nil"/>
-                <w:right w:val="nil"/>
-                <w:between w:val="nil"/>
-              </w:pBdr>
-              <w:spacing w:after="160" w:line="278" w:lineRule="auto"/>
-            </w:pPr>
-            <w:r>
-              <w:rPr>
-                <w:color w:val="000000"/>
-              </w:rPr>
-              <w:t>Build</w:t>
-            </w:r>
-          </w:p>
-        </w:tc>
-        <w:tc>
-          <w:tcPr>
-            <w:tcW w:w="5040" w:type="dxa"/>
-          </w:tcPr>
-          <w:p>
-            <w:r>
-              <w:t>Core Physics Engine &amp; Paddle Movement</w:t>
-            </w:r>
-          </w:p>
-        </w:tc>
-        <w:tc>
-          <w:tcPr>
-            <w:tcW w:w="2425" w:type="dxa"/>
-          </w:tcPr>
-          <w:p/>
+            <w:tcW w:w="1975" w:type="dxa"/>
+          </w:tcPr>
+          <w:p>
+            <w:r>
+              <w:t>3: 03/25 – 03/31</w:t>
+            </w:r>
+          </w:p>
+        </w:tc>
+        <w:tc>
+          <w:tcPr>
+            <w:tcW w:w="3420" w:type="dxa"/>
+          </w:tcPr>
+          <w:p>
+            <w:r>
+              <w:t>Project Design</w:t>
+            </w:r>
+          </w:p>
+        </w:tc>
+        <w:tc>
+          <w:tcPr>
+            <w:tcW w:w="4860" w:type="dxa"/>
+          </w:tcPr>
+          <w:p>
+            <w:r>
+              <w:t>Develop in depth timeline for project</w:t>
+            </w:r>
+            <w:r>
+              <w:t xml:space="preserve"> and break down project into separate but interconnected deliverables</w:t>
+            </w:r>
+            <w:r>
+              <w:t xml:space="preserve">. Further define the project scope and </w:t>
+            </w:r>
+            <w:r>
+              <w:t>requirements.</w:t>
+            </w:r>
+            <w:r>
+              <w:t xml:space="preserve"> Team members should</w:t>
+            </w:r>
+            <w:r>
+              <w:t xml:space="preserve"> spend time to</w:t>
+            </w:r>
+            <w:r>
+              <w:t xml:space="preserve"> </w:t>
+            </w:r>
+            <w:r>
+              <w:t>become</w:t>
+            </w:r>
+            <w:r>
+              <w:t xml:space="preserve"> more familiar with chosen language and GUI library. </w:t>
+            </w:r>
+          </w:p>
         </w:tc>
       </w:tr>
       <w:tr>
         <w:tc>
           <w:tcPr>
-            <w:tcW w:w="1885" w:type="dxa"/>
-          </w:tcPr>
-          <w:p>
-            <w:pPr>
-              <w:numPr>
-                <w:ilvl w:val="0"/>
-                <w:numId w:val="2"/>
-              </w:numPr>
-              <w:pBdr>
-                <w:top w:val="nil"/>
-                <w:left w:val="nil"/>
-                <w:bottom w:val="nil"/>
-                <w:right w:val="nil"/>
-                <w:between w:val="nil"/>
-              </w:pBdr>
-              <w:spacing w:after="160" w:line="278" w:lineRule="auto"/>
-            </w:pPr>
-            <w:r>
-              <w:rPr>
-                <w:color w:val="000000"/>
-              </w:rPr>
-              <w:t>Testing</w:t>
-            </w:r>
-          </w:p>
-        </w:tc>
-        <w:tc>
-          <w:tcPr>
-            <w:tcW w:w="5040" w:type="dxa"/>
-          </w:tcPr>
-          <w:p>
-            <w:r>
-              <w:t>Alpha Testing &amp; Bug Scrub</w:t>
-            </w:r>
-          </w:p>
-        </w:tc>
-        <w:tc>
-          <w:tcPr>
-            <w:tcW w:w="2425" w:type="dxa"/>
-          </w:tcPr>
-          <w:p/>
+            <w:tcW w:w="1975" w:type="dxa"/>
+          </w:tcPr>
+          <w:p>
+            <w:r>
+              <w:t>4: 04/01 – 04/07</w:t>
+            </w:r>
+          </w:p>
+        </w:tc>
+        <w:tc>
+          <w:tcPr>
+            <w:tcW w:w="3420" w:type="dxa"/>
+          </w:tcPr>
+          <w:p>
+            <w:r>
+              <w:t xml:space="preserve">Phase I Source Code </w:t>
+            </w:r>
+          </w:p>
+        </w:tc>
+        <w:tc>
+          <w:tcPr>
+            <w:tcW w:w="4860" w:type="dxa"/>
+          </w:tcPr>
+          <w:p>
+            <w:r>
+              <w:t>Develop a simple, working prototype for the application</w:t>
+            </w:r>
+            <w:r>
+              <w:t xml:space="preserve"> that implements the core functionality of the project. </w:t>
+            </w:r>
+            <w:r>
+              <w:t>Develop and perform test procedures to verify functionality of project.</w:t>
+            </w:r>
+          </w:p>
         </w:tc>
       </w:tr>
       <w:tr>
         <w:tc>
           <w:tcPr>
-            <w:tcW w:w="1885" w:type="dxa"/>
-          </w:tcPr>
-          <w:p>
-            <w:pPr>
-              <w:numPr>
-                <w:ilvl w:val="0"/>
-                <w:numId w:val="2"/>
-              </w:numPr>
-              <w:pBdr>
-                <w:top w:val="nil"/>
-                <w:left w:val="nil"/>
-                <w:bottom w:val="nil"/>
-                <w:right w:val="nil"/>
-                <w:between w:val="nil"/>
-              </w:pBdr>
-              <w:spacing w:after="160" w:line="278" w:lineRule="auto"/>
-            </w:pPr>
-            <w:r>
-              <w:rPr>
-                <w:color w:val="000000"/>
-              </w:rPr>
-              <w:t>Delivery</w:t>
-            </w:r>
-          </w:p>
-        </w:tc>
-        <w:tc>
-          <w:tcPr>
-            <w:tcW w:w="5040" w:type="dxa"/>
-          </w:tcPr>
-          <w:p>
-            <w:r>
-              <w:t>Final Documentation &amp; Presentation</w:t>
-            </w:r>
-          </w:p>
-        </w:tc>
-        <w:tc>
-          <w:tcPr>
-            <w:tcW w:w="2425" w:type="dxa"/>
-          </w:tcPr>
-          <w:p/>
+            <w:tcW w:w="1975" w:type="dxa"/>
+          </w:tcPr>
+          <w:p>
+            <w:r>
+              <w:t>5: 04/08 – 04/14</w:t>
+            </w:r>
+          </w:p>
+        </w:tc>
+        <w:tc>
+          <w:tcPr>
+            <w:tcW w:w="3420" w:type="dxa"/>
+          </w:tcPr>
+          <w:p>
+            <w:r>
+              <w:t>Test Plan</w:t>
+            </w:r>
+          </w:p>
+        </w:tc>
+        <w:tc>
+          <w:tcPr>
+            <w:tcW w:w="4860" w:type="dxa"/>
+          </w:tcPr>
+          <w:p>
+            <w:r>
+              <w:t>Deve</w:t>
+            </w:r>
+            <w:r>
+              <w:t xml:space="preserve">lop a testing plan that defines the </w:t>
+            </w:r>
+            <w:r>
+              <w:t xml:space="preserve">testing strategy and scope along with </w:t>
+            </w:r>
+            <w:r>
+              <w:t>procedures for reporting and fixing bugs.</w:t>
+            </w:r>
+          </w:p>
+        </w:tc>
+      </w:tr>
+      <w:tr>
+        <w:tc>
+          <w:tcPr>
+            <w:tcW w:w="1975" w:type="dxa"/>
+          </w:tcPr>
+          <w:p>
+            <w:r>
+              <w:t>6: 04/15 – 04/21</w:t>
+            </w:r>
+          </w:p>
+        </w:tc>
+        <w:tc>
+          <w:tcPr>
+            <w:tcW w:w="3420" w:type="dxa"/>
+          </w:tcPr>
+          <w:p>
+            <w:r>
+              <w:t>Phase II Source Code</w:t>
+            </w:r>
+          </w:p>
+        </w:tc>
+        <w:tc>
+          <w:tcPr>
+            <w:tcW w:w="4860" w:type="dxa"/>
+          </w:tcPr>
+          <w:p>
+            <w:r>
+              <w:t>Finalize the code of the project</w:t>
+            </w:r>
+            <w:r>
+              <w:t xml:space="preserve">. Employ unit tests to verify the </w:t>
+            </w:r>
+            <w:r>
+              <w:t xml:space="preserve">robustness of the program. </w:t>
+            </w:r>
+            <w:r>
+              <w:t xml:space="preserve">Documentation of the project is due. </w:t>
+            </w:r>
+          </w:p>
+        </w:tc>
+      </w:tr>
+      <w:tr>
+        <w:tc>
+          <w:tcPr>
+            <w:tcW w:w="1975" w:type="dxa"/>
+          </w:tcPr>
+          <w:p>
+            <w:r>
+              <w:t>7: 04/22 – 04/28</w:t>
+            </w:r>
+          </w:p>
+        </w:tc>
+        <w:tc>
+          <w:tcPr>
+            <w:tcW w:w="3420" w:type="dxa"/>
+          </w:tcPr>
+          <w:p>
+            <w:r>
+              <w:t>User Guide</w:t>
+            </w:r>
+          </w:p>
+        </w:tc>
+        <w:tc>
+          <w:tcPr>
+            <w:tcW w:w="4860" w:type="dxa"/>
+          </w:tcPr>
+          <w:p>
+            <w:r>
+              <w:t>Dev</w:t>
+            </w:r>
+            <w:r>
+              <w:t>elop a user guide that provides an</w:t>
+            </w:r>
+            <w:r>
+              <w:t xml:space="preserve"> </w:t>
+            </w:r>
+            <w:r>
+              <w:t>expansive overview of the functionality and specs of the program</w:t>
+            </w:r>
+            <w:r>
+              <w:t xml:space="preserve">, along with installation procedures and </w:t>
+            </w:r>
+            <w:r>
+              <w:t xml:space="preserve">some of the project rationale. </w:t>
+            </w:r>
+          </w:p>
+        </w:tc>
+      </w:tr>
+      <w:tr>
+        <w:tc>
+          <w:tcPr>
+            <w:tcW w:w="1975" w:type="dxa"/>
+          </w:tcPr>
+          <w:p>
+            <w:r>
+              <w:t>8: 04/29 – 05/05</w:t>
+            </w:r>
+          </w:p>
+        </w:tc>
+        <w:tc>
+          <w:tcPr>
+            <w:tcW w:w="3420" w:type="dxa"/>
+          </w:tcPr>
+          <w:p>
+            <w:r>
+              <w:t>Final Code and Presentation</w:t>
+            </w:r>
+          </w:p>
+        </w:tc>
+        <w:tc>
+          <w:tcPr>
+            <w:tcW w:w="4860" w:type="dxa"/>
+          </w:tcPr>
+          <w:p>
+            <w:proofErr w:type="gramStart"/>
+            <w:r>
+              <w:t>Fully</w:t>
+            </w:r>
+            <w:proofErr w:type="gramEnd"/>
+            <w:r>
+              <w:t xml:space="preserve"> </w:t>
+            </w:r>
+            <w:r>
+              <w:t xml:space="preserve">finalize the code and </w:t>
+            </w:r>
+            <w:r>
+              <w:t xml:space="preserve">create a final report that provides an overview of the entire project. </w:t>
+            </w:r>
+          </w:p>
         </w:tc>
       </w:tr>
     </w:tbl>
@@ -1059,6 +1354,119 @@
 <file path=word/numbering.xml><?xml version="1.0" encoding="utf-8"?>
 <w:numbering xmlns:wpc="http://schemas.microsoft.com/office/word/2010/wordprocessingCanvas" xmlns:cx="http://schemas.microsoft.com/office/drawing/2014/chartex" xmlns:cx1="http://schemas.microsoft.com/office/drawing/2015/9/8/chartex" xmlns:cx2="http://schemas.microsoft.com/office/drawing/2015/10/21/chartex" xmlns:cx3="http://schemas.microsoft.com/office/drawing/2016/5/9/chartex" xmlns:cx4="http://schemas.microsoft.com/office/drawing/2016/5/10/chartex" xmlns:cx5="http://schemas.microsoft.com/office/drawing/2016/5/11/chartex" xmlns:cx6="http://schemas.microsoft.com/office/drawing/2016/5/12/chartex" xmlns:cx7="http://schemas.microsoft.com/office/drawing/2016/5/13/chartex" xmlns:cx8="http://schemas.microsoft.com/office/drawing/2016/5/14/chartex" xmlns:mc="http://schemas.openxmlformats.org/markup-compatibility/2006" xmlns:aink="http://schemas.microsoft.com/office/drawing/2016/ink" xmlns:am3d="http://schemas.microsoft.com/office/drawing/2017/model3d" xmlns:o="urn:schemas-microsoft-com:office:office" xmlns:oel="http://schemas.microsoft.com/office/2019/extlst" xmlns:r="http://schemas.openxmlformats.org/officeDocument/2006/relationships" xmlns:m="http://schemas.openxmlformats.org/officeDocument/2006/math" xmlns:v="urn:schemas-microsoft-com:vml" xmlns:wp14="http://schemas.microsoft.com/office/word/2010/wordprocessingDrawing" xmlns:wp="http://schemas.openxmlformats.org/drawingml/2006/wordprocessingDrawing" xmlns:w10="urn:schemas-microsoft-com:office:word" xmlns:w="http://schemas.openxmlformats.org/wordprocessingml/2006/main" xmlns:w14="http://schemas.microsoft.com/office/word/2010/wordml" xmlns:w15="http://schemas.microsoft.com/office/word/2012/wordml" xmlns:w16cex="http://schemas.microsoft.com/office/word/2018/wordml/cex" xmlns:w16cid="http://schemas.microsoft.com/office/word/2016/wordml/cid" xmlns:w16="http://schemas.microsoft.com/office/word/2018/wordml" xmlns:w16du="http://schemas.microsoft.com/office/word/2023/wordml/word16du" xmlns:w16sdtdh="http://schemas.microsoft.com/office/word/2020/wordml/sdtdatahash" xmlns:w16sdtfl="http://schemas.microsoft.com/office/word/2024/wordml/sdtformatlock" xmlns:w16se="http://schemas.microsoft.com/office/word/2015/wordml/symex" xmlns:wpg="http://schemas.microsoft.com/office/word/2010/wordprocessingGroup" xmlns:wpi="http://schemas.microsoft.com/office/word/2010/wordprocessingInk" xmlns:wne="http://schemas.microsoft.com/office/word/2006/wordml" xmlns:wps="http://schemas.microsoft.com/office/word/2010/wordprocessingShape" mc:Ignorable="w14 w15 w16se w16cid w16 w16cex w16sdtdh w16sdtfl w16du wp14">
   <w:abstractNum w:abstractNumId="0" w15:restartNumberingAfterBreak="0">
+    <w:nsid w:val="3703254D"/>
+    <w:multiLevelType w:val="hybridMultilevel"/>
+    <w:tmpl w:val="978AF9F4"/>
+    <w:lvl w:ilvl="0" w:tplc="04090001">
+      <w:start w:val="1"/>
+      <w:numFmt w:val="bullet"/>
+      <w:lvlText w:val=""/>
+      <w:lvlJc w:val="left"/>
+      <w:pPr>
+        <w:ind w:left="720" w:hanging="360"/>
+      </w:pPr>
+      <w:rPr>
+        <w:rFonts w:ascii="Symbol" w:hAnsi="Symbol" w:hint="default"/>
+      </w:rPr>
+    </w:lvl>
+    <w:lvl w:ilvl="1" w:tplc="04090003" w:tentative="1">
+      <w:start w:val="1"/>
+      <w:numFmt w:val="bullet"/>
+      <w:lvlText w:val="o"/>
+      <w:lvlJc w:val="left"/>
+      <w:pPr>
+        <w:ind w:left="1440" w:hanging="360"/>
+      </w:pPr>
+      <w:rPr>
+        <w:rFonts w:ascii="Courier New" w:hAnsi="Courier New" w:cs="Courier New" w:hint="default"/>
+      </w:rPr>
+    </w:lvl>
+    <w:lvl w:ilvl="2" w:tplc="04090005" w:tentative="1">
+      <w:start w:val="1"/>
+      <w:numFmt w:val="bullet"/>
+      <w:lvlText w:val=""/>
+      <w:lvlJc w:val="left"/>
+      <w:pPr>
+        <w:ind w:left="2160" w:hanging="360"/>
+      </w:pPr>
+      <w:rPr>
+        <w:rFonts w:ascii="Wingdings" w:hAnsi="Wingdings" w:hint="default"/>
+      </w:rPr>
+    </w:lvl>
+    <w:lvl w:ilvl="3" w:tplc="04090001" w:tentative="1">
+      <w:start w:val="1"/>
+      <w:numFmt w:val="bullet"/>
+      <w:lvlText w:val=""/>
+      <w:lvlJc w:val="left"/>
+      <w:pPr>
+        <w:ind w:left="2880" w:hanging="360"/>
+      </w:pPr>
+      <w:rPr>
+        <w:rFonts w:ascii="Symbol" w:hAnsi="Symbol" w:hint="default"/>
+      </w:rPr>
+    </w:lvl>
+    <w:lvl w:ilvl="4" w:tplc="04090003" w:tentative="1">
+      <w:start w:val="1"/>
+      <w:numFmt w:val="bullet"/>
+      <w:lvlText w:val="o"/>
+      <w:lvlJc w:val="left"/>
+      <w:pPr>
+        <w:ind w:left="3600" w:hanging="360"/>
+      </w:pPr>
+      <w:rPr>
+        <w:rFonts w:ascii="Courier New" w:hAnsi="Courier New" w:cs="Courier New" w:hint="default"/>
+      </w:rPr>
+    </w:lvl>
+    <w:lvl w:ilvl="5" w:tplc="04090005" w:tentative="1">
+      <w:start w:val="1"/>
+      <w:numFmt w:val="bullet"/>
+      <w:lvlText w:val=""/>
+      <w:lvlJc w:val="left"/>
+      <w:pPr>
+        <w:ind w:left="4320" w:hanging="360"/>
+      </w:pPr>
+      <w:rPr>
+        <w:rFonts w:ascii="Wingdings" w:hAnsi="Wingdings" w:hint="default"/>
+      </w:rPr>
+    </w:lvl>
+    <w:lvl w:ilvl="6" w:tplc="04090001" w:tentative="1">
+      <w:start w:val="1"/>
+      <w:numFmt w:val="bullet"/>
+      <w:lvlText w:val=""/>
+      <w:lvlJc w:val="left"/>
+      <w:pPr>
+        <w:ind w:left="5040" w:hanging="360"/>
+      </w:pPr>
+      <w:rPr>
+        <w:rFonts w:ascii="Symbol" w:hAnsi="Symbol" w:hint="default"/>
+      </w:rPr>
+    </w:lvl>
+    <w:lvl w:ilvl="7" w:tplc="04090003" w:tentative="1">
+      <w:start w:val="1"/>
+      <w:numFmt w:val="bullet"/>
+      <w:lvlText w:val="o"/>
+      <w:lvlJc w:val="left"/>
+      <w:pPr>
+        <w:ind w:left="5760" w:hanging="360"/>
+      </w:pPr>
+      <w:rPr>
+        <w:rFonts w:ascii="Courier New" w:hAnsi="Courier New" w:cs="Courier New" w:hint="default"/>
+      </w:rPr>
+    </w:lvl>
+    <w:lvl w:ilvl="8" w:tplc="04090005" w:tentative="1">
+      <w:start w:val="1"/>
+      <w:numFmt w:val="bullet"/>
+      <w:lvlText w:val=""/>
+      <w:lvlJc w:val="left"/>
+      <w:pPr>
+        <w:ind w:left="6480" w:hanging="360"/>
+      </w:pPr>
+      <w:rPr>
+        <w:rFonts w:ascii="Wingdings" w:hAnsi="Wingdings" w:hint="default"/>
+      </w:rPr>
+    </w:lvl>
+  </w:abstractNum>
+  <w:abstractNum w:abstractNumId="1" w15:restartNumberingAfterBreak="0">
     <w:nsid w:val="45C72166"/>
     <w:multiLevelType w:val="multilevel"/>
     <w:tmpl w:val="E9922730"/>
@@ -1144,7 +1552,7 @@
       </w:pPr>
     </w:lvl>
   </w:abstractNum>
-  <w:abstractNum w:abstractNumId="1" w15:restartNumberingAfterBreak="0">
+  <w:abstractNum w:abstractNumId="2" w15:restartNumberingAfterBreak="0">
     <w:nsid w:val="4BFD5CB8"/>
     <w:multiLevelType w:val="multilevel"/>
     <w:tmpl w:val="77580964"/>
@@ -1257,7 +1665,7 @@
       </w:rPr>
     </w:lvl>
   </w:abstractNum>
-  <w:abstractNum w:abstractNumId="2" w15:restartNumberingAfterBreak="0">
+  <w:abstractNum w:abstractNumId="3" w15:restartNumberingAfterBreak="0">
     <w:nsid w:val="4D062C1C"/>
     <w:multiLevelType w:val="multilevel"/>
     <w:tmpl w:val="D8AE082C"/>
@@ -1371,13 +1779,16 @@
     </w:lvl>
   </w:abstractNum>
   <w:num w:numId="1" w16cid:durableId="35588585">
+    <w:abstractNumId w:val="2"/>
+  </w:num>
+  <w:num w:numId="2" w16cid:durableId="257255750">
     <w:abstractNumId w:val="1"/>
   </w:num>
-  <w:num w:numId="2" w16cid:durableId="257255750">
+  <w:num w:numId="3" w16cid:durableId="97986660">
+    <w:abstractNumId w:val="3"/>
+  </w:num>
+  <w:num w:numId="4" w16cid:durableId="665742134">
     <w:abstractNumId w:val="0"/>
-  </w:num>
-  <w:num w:numId="3" w16cid:durableId="97986660">
-    <w:abstractNumId w:val="2"/>
   </w:num>
 </w:numbering>
 </file>

</xml_diff>

<commit_message>
Added a bit extra to risk management section
</commit_message>
<xml_diff>
--- a/docs/Project Plan.docx
+++ b/docs/Project Plan.docx
@@ -177,10 +177,7 @@
         <w:ind w:firstLine="720"/>
       </w:pPr>
       <w:r>
-        <w:t>The Breakout Game in C++ project is a team-based capstone effort within CMSC 495 focused on the design, development, and delivery of a functional 2D arcade-style game. The project aims to recreate the classic Breakout gameplay experience using modern C++ development practices, emphasizing modular design, real-time interaction, and structured software engineering principles. The system will be implemented as a standalone desktop application and developed collaboratively using version control and defined work</w:t>
-      </w:r>
-      <w:r>
-        <w:t>flows.</w:t>
+        <w:t>The Breakout Game in C++ project is a team-based capstone effort within CMSC 495 focused on the design, development, and delivery of a functional 2D arcade-style game. The project aims to recreate the classic Breakout gameplay experience using modern C++ development practices, emphasizing modular design, real-time interaction, and structured software engineering principles. The system will be implemented as a standalone desktop application and developed collaboratively using version control and defined workflows.</w:t>
       </w:r>
     </w:p>
     <w:p>
@@ -423,10 +420,7 @@
         <w:ind w:firstLine="720"/>
       </w:pPr>
       <w:r>
-        <w:t>The GUI will include, as of now, three main pages; the start screen, the level select screen, and the game play screen. The title/start screen will include the title of the game, the creators, and a button to ‘start’ the game which will bring the user to the level select screen. The level screen will be a grid of buttons that when clicked on take the user to the corresponding level. The level screen will have, as mentioned previously, a paddle, a ball, some number of bricks, some display of lives left, curr</w:t>
-      </w:r>
-      <w:r>
-        <w:t xml:space="preserve">ent score, and maybe even time elapsed in level. </w:t>
+        <w:t xml:space="preserve">The GUI will include, as of now, three main pages; the start screen, the level select screen, and the game play screen. The title/start screen will include the title of the game, the creators, and a button to ‘start’ the game which will bring the user to the level select screen. The level screen will be a grid of buttons that when clicked on take the user to the corresponding level. The level screen will have, as mentioned previously, a paddle, a ball, some number of bricks, some display of lives left, current score, and maybe even time elapsed in level. </w:t>
       </w:r>
     </w:p>
     <w:p>
@@ -870,7 +864,13 @@
         <w:ind w:firstLine="720"/>
       </w:pPr>
       <w:r>
-        <w:t xml:space="preserve">There is varied experience in the c++ </w:t>
+        <w:t xml:space="preserve">There is varied experience in the </w:t>
+      </w:r>
+      <w:r>
+        <w:t>C</w:t>
+      </w:r>
+      <w:r>
+        <w:t xml:space="preserve">++ </w:t>
       </w:r>
       <w:r>
         <w:t>programming language</w:t>
@@ -882,7 +882,13 @@
         <w:t xml:space="preserve">so there should be some time set aside for </w:t>
       </w:r>
       <w:r>
-        <w:t>the members of the team to become more familiar with the c++ language and ou</w:t>
+        <w:t xml:space="preserve">the members of the team to become more familiar with the </w:t>
+      </w:r>
+      <w:r>
+        <w:t>C</w:t>
+      </w:r>
+      <w:r>
+        <w:t>++ language and ou</w:t>
       </w:r>
       <w:r>
         <w:t>r chosen GUI library so that all members of the team can</w:t>
@@ -896,26 +902,24 @@
       <w:r>
         <w:t xml:space="preserve">contribute </w:t>
       </w:r>
-      <w:proofErr w:type="gramStart"/>
-      <w:r>
-        <w:t>in</w:t>
-      </w:r>
-      <w:proofErr w:type="gramEnd"/>
+      <w:r>
+        <w:t>to</w:t>
+      </w:r>
       <w:r>
         <w:t xml:space="preserve"> the development of the project.</w:t>
       </w:r>
-    </w:p>
-    <w:p>
-      <w:pPr>
-        <w:pBdr>
-          <w:top w:val="nil"/>
-          <w:left w:val="nil"/>
-          <w:bottom w:val="nil"/>
-          <w:right w:val="nil"/>
-          <w:between w:val="nil"/>
-        </w:pBdr>
-        <w:ind w:firstLine="720"/>
-      </w:pPr>
+      <w:r>
+        <w:t xml:space="preserve"> Also agree on some coding </w:t>
+      </w:r>
+      <w:r>
+        <w:t>conventions</w:t>
+      </w:r>
+      <w:r>
+        <w:t xml:space="preserve"> so that code is </w:t>
+      </w:r>
+      <w:r>
+        <w:t xml:space="preserve">consistent and easier to read/write/debug for all people in the project. </w:t>
+      </w:r>
     </w:p>
     <w:p>
       <w:pPr>

</xml_diff>

<commit_message>
Added specificreferences to SFML as our GUI Library. Added list of possible roles needed to be assigned
</commit_message>
<xml_diff>
--- a/docs/Project Plan.docx
+++ b/docs/Project Plan.docx
@@ -177,7 +177,10 @@
         <w:ind w:firstLine="720"/>
       </w:pPr>
       <w:r>
-        <w:t>The Breakout Game in C++ project is a team-based capstone effort within CMSC 495 focused on the design, development, and delivery of a functional 2D arcade-style game. The project aims to recreate the classic Breakout gameplay experience using modern C++ development practices, emphasizing modular design, real-time interaction, and structured software engineering principles. The system will be implemented as a standalone desktop application and developed collaboratively using version control and defined workflows.</w:t>
+        <w:t>The Breakout Game in C++ project is a team-based capstone effort within CMSC 495 focused on the design, development, and delivery of a functional 2D arcade-style game. The project aims to recreate the classic Breakout gameplay experience using modern C++ development practices, emphasizing modular design, real-time interaction, and structured software engineering principles. The system will be implemented as a standalone desktop application and developed collaboratively using version control and defined work</w:t>
+      </w:r>
+      <w:r>
+        <w:t>flows.</w:t>
       </w:r>
     </w:p>
     <w:p>
@@ -229,15 +232,10 @@
         <w:ind w:firstLine="720"/>
       </w:pPr>
       <w:r>
-        <w:t xml:space="preserve">The Breakout Game in C++ project involves the design and development of a standalone 2D arcade-style application that recreates the core mechanics of the classic Breakout game. The system centers around player interaction with a paddle to control the trajectory of a moving ball, with the objective of destroying a grid of bricks while preventing the ball from leaving the play area. The application will be implemented in C++ using an appropriate graphics/game development </w:t>
-      </w:r>
-      <w:proofErr w:type="gramStart"/>
-      <w:r>
-        <w:t>library, and</w:t>
-      </w:r>
-      <w:proofErr w:type="gramEnd"/>
-      <w:r>
-        <w:t xml:space="preserve"> will run as a desktop-based program.</w:t>
+        <w:t>The Breakout Game in C++ project involves the design and development of a standalone 2D arcade-style application that recreates the core mechanics of the classic Breakout game. The system centers around player interaction with a paddle to control the trajectory of a moving ball, with the objective of destroying a grid of bricks while preventing the ball from leaving the play area. The application will be implemented in C++ using an appropriate graphics/game development library, and will run as a desktop-bas</w:t>
+      </w:r>
+      <w:r>
+        <w:t>ed program.</w:t>
       </w:r>
     </w:p>
     <w:p>
@@ -322,15 +320,7 @@
         <w:ind w:firstLine="720"/>
       </w:pPr>
       <w:r>
-        <w:t xml:space="preserve">The </w:t>
-      </w:r>
-      <w:proofErr w:type="gramStart"/>
-      <w:r>
-        <w:t>project further</w:t>
-      </w:r>
-      <w:proofErr w:type="gramEnd"/>
-      <w:r>
-        <w:t xml:space="preserve"> aims to implement the core gameplay systems in a structured and incremental manner. These systems include the game window and main loop, paddle input and movement, ball motion and boundary interaction, brick grid management, and collision handling between gameplay elements. These features represent the minimum </w:t>
+        <w:t xml:space="preserve">The project further aims to implement the core gameplay systems in a structured and incremental manner. These systems include the game window and main loop, paddle input and movement, ball motion and boundary interaction, brick grid management, and collision handling between gameplay elements. These features represent the minimum </w:t>
       </w:r>
       <w:r>
         <w:lastRenderedPageBreak/>
@@ -420,7 +410,10 @@
         <w:ind w:firstLine="720"/>
       </w:pPr>
       <w:r>
-        <w:t xml:space="preserve">The GUI will include, as of now, three main pages; the start screen, the level select screen, and the game play screen. The title/start screen will include the title of the game, the creators, and a button to ‘start’ the game which will bring the user to the level select screen. The level screen will be a grid of buttons that when clicked on take the user to the corresponding level. The level screen will have, as mentioned previously, a paddle, a ball, some number of bricks, some display of lives left, current score, and maybe even time elapsed in level. </w:t>
+        <w:t>The GUI will include, as of now, three main pages; the start screen, the level select screen, and the game play screen. The title/start screen will include the title of the game, the creators, and a button to ‘start’ the game which will bring the user to the level select screen. The level screen will be a grid of buttons that when clicked on take the user to the corresponding level. The level screen will have, as mentioned previously, a paddle, a ball, some number of bricks, some display of lives left, curr</w:t>
+      </w:r>
+      <w:r>
+        <w:t xml:space="preserve">ent score, and maybe even time elapsed in level. </w:t>
       </w:r>
     </w:p>
     <w:p>
@@ -666,22 +659,143 @@
         <w:ind w:firstLine="360"/>
         <w:rPr>
           <w:color w:val="000000"/>
+          <w:u w:val="single"/>
         </w:rPr>
       </w:pPr>
+      <w:r>
+        <w:rPr>
+          <w:color w:val="000000"/>
+          <w:u w:val="single"/>
+        </w:rPr>
+        <w:t>Roles Remaining to Assign:</w:t>
+      </w:r>
+    </w:p>
+    <w:p>
+      <w:pPr>
+        <w:pStyle w:val="ListParagraph"/>
+        <w:numPr>
+          <w:ilvl w:val="0"/>
+          <w:numId w:val="5"/>
+        </w:numPr>
+        <w:rPr>
+          <w:color w:val="000000"/>
+          <w:u w:val="single"/>
+        </w:rPr>
+      </w:pPr>
+      <w:r>
+        <w:rPr>
+          <w:color w:val="000000"/>
+          <w:u w:val="single"/>
+        </w:rPr>
+        <w:t>Project Lead</w:t>
+      </w:r>
+    </w:p>
+    <w:p>
+      <w:pPr>
+        <w:pStyle w:val="ListParagraph"/>
+        <w:numPr>
+          <w:ilvl w:val="0"/>
+          <w:numId w:val="5"/>
+        </w:numPr>
+        <w:rPr>
+          <w:color w:val="000000"/>
+          <w:u w:val="single"/>
+        </w:rPr>
+      </w:pPr>
+      <w:r>
+        <w:rPr>
+          <w:color w:val="000000"/>
+          <w:u w:val="single"/>
+        </w:rPr>
+        <w:t>Lead Developer</w:t>
+      </w:r>
+    </w:p>
+    <w:p>
+      <w:pPr>
+        <w:pStyle w:val="ListParagraph"/>
+        <w:numPr>
+          <w:ilvl w:val="0"/>
+          <w:numId w:val="5"/>
+        </w:numPr>
+        <w:rPr>
+          <w:color w:val="000000"/>
+          <w:u w:val="single"/>
+        </w:rPr>
+      </w:pPr>
+      <w:r>
+        <w:rPr>
+          <w:color w:val="000000"/>
+          <w:u w:val="single"/>
+        </w:rPr>
+        <w:t>Developer</w:t>
+      </w:r>
+    </w:p>
+    <w:p>
+      <w:pPr>
+        <w:pStyle w:val="ListParagraph"/>
+        <w:numPr>
+          <w:ilvl w:val="0"/>
+          <w:numId w:val="5"/>
+        </w:numPr>
+        <w:rPr>
+          <w:color w:val="000000"/>
+          <w:u w:val="single"/>
+        </w:rPr>
+      </w:pPr>
+      <w:r>
+        <w:rPr>
+          <w:color w:val="000000"/>
+          <w:u w:val="single"/>
+        </w:rPr>
+        <w:t>Developer</w:t>
+      </w:r>
+    </w:p>
+    <w:p>
+      <w:pPr>
+        <w:pStyle w:val="ListParagraph"/>
+        <w:numPr>
+          <w:ilvl w:val="0"/>
+          <w:numId w:val="5"/>
+        </w:numPr>
+        <w:rPr>
+          <w:color w:val="000000"/>
+          <w:u w:val="single"/>
+        </w:rPr>
+      </w:pPr>
+      <w:r>
+        <w:rPr>
+          <w:color w:val="000000"/>
+          <w:u w:val="single"/>
+        </w:rPr>
+        <w:t>QA/Documentation</w:t>
+      </w:r>
     </w:p>
     <w:p>
       <w:pPr>
         <w:ind w:firstLine="360"/>
       </w:pPr>
       <w:r>
-        <w:t xml:space="preserve">The programming language that will be used for the majority of this project will be C++. The libraries being used will be </w:t>
+        <w:lastRenderedPageBreak/>
+        <w:t>T</w:t>
+      </w:r>
+      <w:r>
+        <w:t>he programming language that will be used for the majority of this project will be C++. The libraries being used will</w:t>
       </w:r>
       <w:r>
         <w:rPr>
           <w:i/>
           <w:iCs/>
         </w:rPr>
-        <w:t>[What libraries are being used]</w:t>
+        <w:t xml:space="preserve"> </w:t>
+      </w:r>
+      <w:r>
+        <w:t xml:space="preserve">be the base </w:t>
+      </w:r>
+      <w:r>
+        <w:t>(std) C++ library along with SFML</w:t>
+      </w:r>
+      <w:r>
+        <w:t xml:space="preserve"> (Simple and Fast Multimedia Library) for the </w:t>
       </w:r>
       <w:r>
         <w:t>. There will be a budget of $0.00 USD, which is standard for an academic project and open-source or other free tools will be used. For version control, we will be using Git and GitHub.</w:t>
@@ -693,7 +807,6 @@
         <w:pStyle w:val="Heading1"/>
       </w:pPr>
       <w:r>
-        <w:lastRenderedPageBreak/>
         <w:t>Communication Plan</w:t>
       </w:r>
     </w:p>
@@ -826,15 +939,7 @@
         <w:t xml:space="preserve">it should be committed to the repo for others to use as soon as possible. This should allow for </w:t>
       </w:r>
       <w:r>
-        <w:t xml:space="preserve">there to be minimal </w:t>
-      </w:r>
-      <w:proofErr w:type="gramStart"/>
-      <w:r>
-        <w:t>merge</w:t>
-      </w:r>
-      <w:proofErr w:type="gramEnd"/>
-      <w:r>
-        <w:t xml:space="preserve"> </w:t>
+        <w:t xml:space="preserve">there to be minimal merge </w:t>
       </w:r>
       <w:r>
         <w:t>conflicts</w:t>
@@ -864,6 +969,7 @@
         <w:ind w:firstLine="720"/>
       </w:pPr>
       <w:r>
+        <w:lastRenderedPageBreak/>
         <w:t xml:space="preserve">There is varied experience in the </w:t>
       </w:r>
       <w:r>
@@ -888,10 +994,13 @@
         <w:t>C</w:t>
       </w:r>
       <w:r>
-        <w:t>++ language and ou</w:t>
-      </w:r>
-      <w:r>
-        <w:t>r chosen GUI library so that all members of the team can</w:t>
+        <w:t xml:space="preserve">++ language and </w:t>
+      </w:r>
+      <w:r>
+        <w:t>SFML (GUI library)</w:t>
+      </w:r>
+      <w:r>
+        <w:t>so that all members of the team can</w:t>
       </w:r>
       <w:r>
         <w:t xml:space="preserve"> </w:t>
@@ -926,7 +1035,6 @@
         <w:pStyle w:val="Heading1"/>
       </w:pPr>
       <w:r>
-        <w:lastRenderedPageBreak/>
         <w:t>Schedule and Milestones</w:t>
       </w:r>
     </w:p>
@@ -1325,13 +1433,8 @@
             <w:tcW w:w="4860" w:type="dxa"/>
           </w:tcPr>
           <w:p>
-            <w:proofErr w:type="gramStart"/>
-            <w:r>
-              <w:t>Fully</w:t>
-            </w:r>
-            <w:proofErr w:type="gramEnd"/>
-            <w:r>
-              <w:t xml:space="preserve"> </w:t>
+            <w:r>
+              <w:t xml:space="preserve">Fully </w:t>
             </w:r>
             <w:r>
               <w:t xml:space="preserve">finalize the code and </w:t>
@@ -1782,6 +1885,119 @@
       </w:rPr>
     </w:lvl>
   </w:abstractNum>
+  <w:abstractNum w:abstractNumId="4" w15:restartNumberingAfterBreak="0">
+    <w:nsid w:val="74E72487"/>
+    <w:multiLevelType w:val="hybridMultilevel"/>
+    <w:tmpl w:val="1EAC0386"/>
+    <w:lvl w:ilvl="0" w:tplc="04090001">
+      <w:start w:val="1"/>
+      <w:numFmt w:val="bullet"/>
+      <w:lvlText w:val=""/>
+      <w:lvlJc w:val="left"/>
+      <w:pPr>
+        <w:ind w:left="1080" w:hanging="360"/>
+      </w:pPr>
+      <w:rPr>
+        <w:rFonts w:ascii="Symbol" w:hAnsi="Symbol" w:hint="default"/>
+      </w:rPr>
+    </w:lvl>
+    <w:lvl w:ilvl="1" w:tplc="04090003" w:tentative="1">
+      <w:start w:val="1"/>
+      <w:numFmt w:val="bullet"/>
+      <w:lvlText w:val="o"/>
+      <w:lvlJc w:val="left"/>
+      <w:pPr>
+        <w:ind w:left="1800" w:hanging="360"/>
+      </w:pPr>
+      <w:rPr>
+        <w:rFonts w:ascii="Courier New" w:hAnsi="Courier New" w:cs="Courier New" w:hint="default"/>
+      </w:rPr>
+    </w:lvl>
+    <w:lvl w:ilvl="2" w:tplc="04090005" w:tentative="1">
+      <w:start w:val="1"/>
+      <w:numFmt w:val="bullet"/>
+      <w:lvlText w:val=""/>
+      <w:lvlJc w:val="left"/>
+      <w:pPr>
+        <w:ind w:left="2520" w:hanging="360"/>
+      </w:pPr>
+      <w:rPr>
+        <w:rFonts w:ascii="Wingdings" w:hAnsi="Wingdings" w:hint="default"/>
+      </w:rPr>
+    </w:lvl>
+    <w:lvl w:ilvl="3" w:tplc="04090001" w:tentative="1">
+      <w:start w:val="1"/>
+      <w:numFmt w:val="bullet"/>
+      <w:lvlText w:val=""/>
+      <w:lvlJc w:val="left"/>
+      <w:pPr>
+        <w:ind w:left="3240" w:hanging="360"/>
+      </w:pPr>
+      <w:rPr>
+        <w:rFonts w:ascii="Symbol" w:hAnsi="Symbol" w:hint="default"/>
+      </w:rPr>
+    </w:lvl>
+    <w:lvl w:ilvl="4" w:tplc="04090003" w:tentative="1">
+      <w:start w:val="1"/>
+      <w:numFmt w:val="bullet"/>
+      <w:lvlText w:val="o"/>
+      <w:lvlJc w:val="left"/>
+      <w:pPr>
+        <w:ind w:left="3960" w:hanging="360"/>
+      </w:pPr>
+      <w:rPr>
+        <w:rFonts w:ascii="Courier New" w:hAnsi="Courier New" w:cs="Courier New" w:hint="default"/>
+      </w:rPr>
+    </w:lvl>
+    <w:lvl w:ilvl="5" w:tplc="04090005" w:tentative="1">
+      <w:start w:val="1"/>
+      <w:numFmt w:val="bullet"/>
+      <w:lvlText w:val=""/>
+      <w:lvlJc w:val="left"/>
+      <w:pPr>
+        <w:ind w:left="4680" w:hanging="360"/>
+      </w:pPr>
+      <w:rPr>
+        <w:rFonts w:ascii="Wingdings" w:hAnsi="Wingdings" w:hint="default"/>
+      </w:rPr>
+    </w:lvl>
+    <w:lvl w:ilvl="6" w:tplc="04090001" w:tentative="1">
+      <w:start w:val="1"/>
+      <w:numFmt w:val="bullet"/>
+      <w:lvlText w:val=""/>
+      <w:lvlJc w:val="left"/>
+      <w:pPr>
+        <w:ind w:left="5400" w:hanging="360"/>
+      </w:pPr>
+      <w:rPr>
+        <w:rFonts w:ascii="Symbol" w:hAnsi="Symbol" w:hint="default"/>
+      </w:rPr>
+    </w:lvl>
+    <w:lvl w:ilvl="7" w:tplc="04090003" w:tentative="1">
+      <w:start w:val="1"/>
+      <w:numFmt w:val="bullet"/>
+      <w:lvlText w:val="o"/>
+      <w:lvlJc w:val="left"/>
+      <w:pPr>
+        <w:ind w:left="6120" w:hanging="360"/>
+      </w:pPr>
+      <w:rPr>
+        <w:rFonts w:ascii="Courier New" w:hAnsi="Courier New" w:cs="Courier New" w:hint="default"/>
+      </w:rPr>
+    </w:lvl>
+    <w:lvl w:ilvl="8" w:tplc="04090005" w:tentative="1">
+      <w:start w:val="1"/>
+      <w:numFmt w:val="bullet"/>
+      <w:lvlText w:val=""/>
+      <w:lvlJc w:val="left"/>
+      <w:pPr>
+        <w:ind w:left="6840" w:hanging="360"/>
+      </w:pPr>
+      <w:rPr>
+        <w:rFonts w:ascii="Wingdings" w:hAnsi="Wingdings" w:hint="default"/>
+      </w:rPr>
+    </w:lvl>
+  </w:abstractNum>
   <w:num w:numId="1" w16cid:durableId="35588585">
     <w:abstractNumId w:val="2"/>
   </w:num>
@@ -1793,6 +2009,9 @@
   </w:num>
   <w:num w:numId="4" w16cid:durableId="665742134">
     <w:abstractNumId w:val="0"/>
+  </w:num>
+  <w:num w:numId="5" w16cid:durableId="1406416752">
+    <w:abstractNumId w:val="4"/>
   </w:num>
 </w:numbering>
 </file>

</xml_diff>

<commit_message>
Fixed some grammar issues that were identified in Word for th e Project plan document.
</commit_message>
<xml_diff>
--- a/docs/Project Plan.docx
+++ b/docs/Project Plan.docx
@@ -232,10 +232,13 @@
         <w:ind w:firstLine="720"/>
       </w:pPr>
       <w:r>
-        <w:t>The Breakout Game in C++ project involves the design and development of a standalone 2D arcade-style application that recreates the core mechanics of the classic Breakout game. The system centers around player interaction with a paddle to control the trajectory of a moving ball, with the objective of destroying a grid of bricks while preventing the ball from leaving the play area. The application will be implemented in C++ using an appropriate graphics/game development library, and will run as a desktop-bas</w:t>
-      </w:r>
-      <w:r>
-        <w:t>ed program.</w:t>
+        <w:t xml:space="preserve">The Breakout Game in C++ project involves the design and development of a standalone 2D arcade-style application that recreates the core mechanics of the classic Breakout game. The system centers around player interaction with a paddle to control the trajectory of a moving ball, with the objective of destroying a grid of bricks while preventing the ball from leaving the play area. The application will be implemented in C++ using an appropriate graphics/game development </w:t>
+      </w:r>
+      <w:r>
+        <w:t>library and</w:t>
+      </w:r>
+      <w:r>
+        <w:t xml:space="preserve"> will run as a desktop-based program.</w:t>
       </w:r>
     </w:p>
     <w:p>
@@ -320,7 +323,13 @@
         <w:ind w:firstLine="720"/>
       </w:pPr>
       <w:r>
-        <w:t xml:space="preserve">The project further aims to implement the core gameplay systems in a structured and incremental manner. These systems include the game window and main loop, paddle input and movement, ball motion and boundary interaction, brick grid management, and collision handling between gameplay elements. These features represent the minimum </w:t>
+        <w:t xml:space="preserve">The </w:t>
+      </w:r>
+      <w:r>
+        <w:t>project</w:t>
+      </w:r>
+      <w:r>
+        <w:t xml:space="preserve"> aims to implement the core gameplay systems in a structured and incremental manner. These systems include the game window and main loop, paddle input and movement, ball motion and boundary interaction, brick grid management, and collision handling between gameplay elements. These features represent the minimum </w:t>
       </w:r>
       <w:r>
         <w:lastRenderedPageBreak/>
@@ -390,7 +399,21 @@
         <w:ind w:firstLine="720"/>
       </w:pPr>
       <w:r>
-        <w:t xml:space="preserve">The items that need to be to be created for each level will include; the paddle, the ball, and an arrangement of bricks that corresponds to the level the user is currently on. This will likely require creation of objects for each of the above to be stored in a corresponding level object for each level. </w:t>
+        <w:t xml:space="preserve">The items that need to be to be created for each level will </w:t>
+      </w:r>
+      <w:r>
+        <w:t>include</w:t>
+      </w:r>
+      <w:r>
+        <w:t xml:space="preserve"> the paddle, the ball, and an arrangement of bricks that corresponds to the level the user is currently </w:t>
+      </w:r>
+      <w:proofErr w:type="gramStart"/>
+      <w:r>
+        <w:t>on</w:t>
+      </w:r>
+      <w:proofErr w:type="gramEnd"/>
+      <w:r>
+        <w:t xml:space="preserve">. This will likely require creation of objects for each of the above to be stored in a corresponding level object for each level. </w:t>
       </w:r>
     </w:p>
     <w:p>
@@ -398,11 +421,20 @@
         <w:ind w:firstLine="720"/>
       </w:pPr>
       <w:r>
-        <w:t xml:space="preserve">The physics engine requires moving the balls current position based on a velocity vector, handling a collision with either a wall or a brick, and knowing when the ball goes out of bounds and a life should be lost. The gameplay engine should track lives lost to see when to end the game that way, track the bricks that are left to see when to end the game that way, track the time taken to finish, and calculate a score when the game is over.  The </w:t>
+        <w:t xml:space="preserve">The physics engine requires moving the </w:t>
+      </w:r>
+      <w:r>
+        <w:t>balls’</w:t>
+      </w:r>
+      <w:r>
+        <w:t xml:space="preserve"> current position based on a velocity vector, handling a collision with either a wall or a brick, and knowing when the ball goes out of bounds and a life should be lost. The gameplay engine should track lives lost to see when to end the game that way, track the bricks that are left to see when to end the game that way, track the time taken to finish, and calculate a score when the game is over.  The </w:t>
       </w:r>
       <w:r>
         <w:lastRenderedPageBreak/>
-        <w:t>game engine will also connect the keypresses of the users to the intended game actions, which will only be a key to make the paddle go leftward and one to make it go rightward.</w:t>
+        <w:t xml:space="preserve">game engine will also connect the keypresses of the users to the intended game actions, which will only be a </w:t>
+      </w:r>
+      <w:r>
+        <w:t>key to make the paddle go leftward and one to make it go rightward.</w:t>
       </w:r>
     </w:p>
     <w:p>
@@ -421,7 +453,13 @@
         <w:ind w:firstLine="720"/>
       </w:pPr>
       <w:r>
-        <w:t xml:space="preserve">The last main in-scope addition would be the improvement of VFX and  addition SFX. The SFX additions could include background music, a sound when clicking on buttons, as sound when a block breaks, and when the ball bounces off the wall. VFX additions could include having the blocks break apart when destroyed instead of instantly disappearing. </w:t>
+        <w:t xml:space="preserve">The last main in-scope addition would be the improvement of VFX </w:t>
+      </w:r>
+      <w:r>
+        <w:t>and addition</w:t>
+      </w:r>
+      <w:r>
+        <w:t xml:space="preserve"> SFX. The SFX additions could include background music, a sound when clicking on buttons, as sound when a block breaks, and when the ball bounces off the wall. VFX additions could include having the blocks break apart when destroyed instead of instantly disappearing. </w:t>
       </w:r>
     </w:p>
     <w:p>
@@ -429,7 +467,15 @@
         <w:ind w:firstLine="720"/>
       </w:pPr>
       <w:r>
-        <w:t xml:space="preserve">Some additional features that could be implemented but are out of scope for the initial project, if the time and resources are available, would be a leader board for high scores for each level, but that would only be implemented after extensive testing of the in-scope requirements. Additional out-of-scope portions would be enabling multiplayer, as that would involve a massive increase in the effort and time required in the somewhat limited amount of time that we have. </w:t>
+        <w:t xml:space="preserve">Some additional features that could be implemented but are out of scope for the initial project, if the time and resources are available, would be a leader board for high scores for each level, but that would only be implemented after extensive testing of the in-scope requirements. Additional out-of-scope portions would be enabling </w:t>
+      </w:r>
+      <w:proofErr w:type="gramStart"/>
+      <w:r>
+        <w:t>multiplayer</w:t>
+      </w:r>
+      <w:proofErr w:type="gramEnd"/>
+      <w:r>
+        <w:t xml:space="preserve">, as that would involve a massive increase in the effort and time required in the somewhat limited amount of time that we have. </w:t>
       </w:r>
     </w:p>
     <w:p>
@@ -575,8 +621,13 @@
           </w:tcPr>
           <w:p>
             <w:r>
-              <w:t>Ethan Wasniak</w:t>
-            </w:r>
+              <w:t xml:space="preserve">Ethan </w:t>
+            </w:r>
+            <w:proofErr w:type="spellStart"/>
+            <w:r>
+              <w:t>Wasniak</w:t>
+            </w:r>
+            <w:proofErr w:type="spellEnd"/>
           </w:p>
         </w:tc>
         <w:tc>
@@ -683,7 +734,15 @@
           </w:tcPr>
           <w:p>
             <w:r>
-              <w:t>Keeps team on track with milestone and deliverables</w:t>
+              <w:t xml:space="preserve">Keeps team on track with </w:t>
+            </w:r>
+            <w:proofErr w:type="gramStart"/>
+            <w:r>
+              <w:t>milestone</w:t>
+            </w:r>
+            <w:proofErr w:type="gramEnd"/>
+            <w:r>
+              <w:t xml:space="preserve"> and deliverables</w:t>
             </w:r>
           </w:p>
         </w:tc>
@@ -753,7 +812,14 @@
         <w:ind w:firstLine="360"/>
       </w:pPr>
       <w:r>
-        <w:t>The programming language that will be used for the majority of this project will be C++. The libraries being used will</w:t>
+        <w:lastRenderedPageBreak/>
+        <w:t xml:space="preserve">The programming language that will be used for </w:t>
+      </w:r>
+      <w:r>
+        <w:t>most of</w:t>
+      </w:r>
+      <w:r>
+        <w:t xml:space="preserve"> this project will be C++. The libraries being used will</w:t>
       </w:r>
       <w:r>
         <w:rPr>
@@ -770,6 +836,9 @@
       </w:r>
       <w:r>
         <w:t xml:space="preserve"> (Simple and Fast Multimedia Library) for the </w:t>
+      </w:r>
+      <w:r>
+        <w:t>GUI</w:t>
       </w:r>
       <w:r>
         <w:t>. There will be a budget of $0.00 USD, which is standard for an academic project and open-source or other free tools will be used. For version control, we will be using Git and GitHub.</w:t>
@@ -913,7 +982,15 @@
         <w:t xml:space="preserve">it should be committed to the repo for others to use as soon as possible. This should allow for </w:t>
       </w:r>
       <w:r>
-        <w:t xml:space="preserve">there to be minimal merge </w:t>
+        <w:t xml:space="preserve">there to be minimal </w:t>
+      </w:r>
+      <w:proofErr w:type="gramStart"/>
+      <w:r>
+        <w:t>merge</w:t>
+      </w:r>
+      <w:proofErr w:type="gramEnd"/>
+      <w:r>
+        <w:t xml:space="preserve"> </w:t>
       </w:r>
       <w:r>
         <w:t>conflicts</w:t>
@@ -922,7 +999,6 @@
         <w:t xml:space="preserve"> when </w:t>
       </w:r>
       <w:r>
-        <w:lastRenderedPageBreak/>
         <w:t>pushing code to or pulling code from the repo and</w:t>
       </w:r>
       <w:r>
@@ -944,6 +1020,7 @@
         <w:ind w:firstLine="720"/>
       </w:pPr>
       <w:r>
+        <w:lastRenderedPageBreak/>
         <w:t xml:space="preserve">There is varied experience in the </w:t>
       </w:r>
       <w:r>
@@ -971,10 +1048,13 @@
         <w:t xml:space="preserve">++ language and </w:t>
       </w:r>
       <w:r>
-        <w:t>SFML (GUI library)</w:t>
-      </w:r>
-      <w:r>
-        <w:t>so that all members of the team can</w:t>
+        <w:t xml:space="preserve">SFML (GUI </w:t>
+      </w:r>
+      <w:r>
+        <w:t>library) so</w:t>
+      </w:r>
+      <w:r>
+        <w:t xml:space="preserve"> that all members of the team can</w:t>
       </w:r>
       <w:r>
         <w:t xml:space="preserve"> </w:t>
@@ -1323,7 +1403,15 @@
               <w:t>Finalize the code of the project</w:t>
             </w:r>
             <w:r>
-              <w:t xml:space="preserve">. Employ unit tests to verify the </w:t>
+              <w:t xml:space="preserve">. </w:t>
+            </w:r>
+            <w:proofErr w:type="gramStart"/>
+            <w:r>
+              <w:t>Employ</w:t>
+            </w:r>
+            <w:proofErr w:type="gramEnd"/>
+            <w:r>
+              <w:t xml:space="preserve"> unit tests to verify the </w:t>
             </w:r>
             <w:r>
               <w:t xml:space="preserve">robustness of the program. </w:t>
@@ -1388,7 +1476,6 @@
           </w:tcPr>
           <w:p>
             <w:r>
-              <w:lastRenderedPageBreak/>
               <w:t>8: 04/29 – 05/05</w:t>
             </w:r>
           </w:p>
@@ -1408,8 +1495,13 @@
             <w:tcW w:w="4860" w:type="dxa"/>
           </w:tcPr>
           <w:p>
-            <w:r>
-              <w:t xml:space="preserve">Fully </w:t>
+            <w:proofErr w:type="gramStart"/>
+            <w:r>
+              <w:t>Fully</w:t>
+            </w:r>
+            <w:proofErr w:type="gramEnd"/>
+            <w:r>
+              <w:t xml:space="preserve"> </w:t>
             </w:r>
             <w:r>
               <w:t xml:space="preserve">finalize the code and </w:t>

</xml_diff>